<commit_message>
Expand v2 OpenNutri work reports
</commit_message>
<xml_diff>
--- a/docs/defense/docx/OpenNutri_Work_Report_Arciel_v2.docx
+++ b/docs/defense/docx/OpenNutri_Work_Report_Arciel_v2.docx
@@ -3507,6 +3507,3681 @@
         <w:t xml:space="preserve">at the current snapshot. The work also carries the highest operational risk: live database security, model quota reliability, unattended GitHub Actions, and data-quality truth all depend on it.</w:t>
       </w:r>
     </w:p>
+    <w:p>
+      <w:pPr>
+        <w:pStyle w:val="Heading2"/>
+      </w:pPr>
+      <w:bookmarkStart w:id="30" w:name="expanded-backend-ops-integration-ledger"/>
+      <w:r>
+        <w:t xml:space="preserve">Expanded Backend / Ops / Integration Ledger</w:t>
+      </w:r>
+      <w:bookmarkEnd w:id="30"/>
+    </w:p>
+    <w:p>
+      <w:pPr>
+        <w:pStyle w:val="Heading3"/>
+      </w:pPr>
+      <w:bookmarkStart w:id="31" w:name="Xba970753108605dd2d98e162748ecc7a65d1359"/>
+      <w:r>
+        <w:t xml:space="preserve">A. Repository Reorganization and Baseline Pipeline</w:t>
+      </w:r>
+      <w:bookmarkEnd w:id="31"/>
+    </w:p>
+    <w:p>
+      <w:pPr>
+        <w:pStyle w:val="FirstParagraph"/>
+      </w:pPr>
+      <w:r>
+        <w:rPr>
+          <w:b/>
+        </w:rPr>
+        <w:t xml:space="preserve">When:</w:t>
+      </w:r>
+      <w:r>
+        <w:t xml:space="preserve"> </w:t>
+      </w:r>
+      <w:r>
+        <w:t xml:space="preserve">2026-03-09 to 2026-03-15.</w:t>
+      </w:r>
+      <w:r>
+        <w:t xml:space="preserve"> </w:t>
+      </w:r>
+      <w:r>
+        <w:rPr>
+          <w:b/>
+        </w:rPr>
+        <w:t xml:space="preserve">Commits:</w:t>
+      </w:r>
+      <w:r>
+        <w:t xml:space="preserve"> </w:t>
+      </w:r>
+      <w:r>
+        <w:rPr>
+          <w:rStyle w:val="VerbatimChar"/>
+        </w:rPr>
+        <w:t xml:space="preserve">8728564</w:t>
+      </w:r>
+      <w:r>
+        <w:t xml:space="preserve">,</w:t>
+      </w:r>
+      <w:r>
+        <w:t xml:space="preserve"> </w:t>
+      </w:r>
+      <w:r>
+        <w:rPr>
+          <w:rStyle w:val="VerbatimChar"/>
+        </w:rPr>
+        <w:t xml:space="preserve">ed58f87</w:t>
+      </w:r>
+      <w:r>
+        <w:t xml:space="preserve">,</w:t>
+      </w:r>
+      <w:r>
+        <w:t xml:space="preserve"> </w:t>
+      </w:r>
+      <w:r>
+        <w:rPr>
+          <w:rStyle w:val="VerbatimChar"/>
+        </w:rPr>
+        <w:t xml:space="preserve">76e2c06</w:t>
+      </w:r>
+      <w:r>
+        <w:t xml:space="preserve">,</w:t>
+      </w:r>
+      <w:r>
+        <w:t xml:space="preserve"> </w:t>
+      </w:r>
+      <w:r>
+        <w:rPr>
+          <w:rStyle w:val="VerbatimChar"/>
+        </w:rPr>
+        <w:t xml:space="preserve">24c1755</w:t>
+      </w:r>
+      <w:r>
+        <w:t xml:space="preserve">,</w:t>
+      </w:r>
+      <w:r>
+        <w:t xml:space="preserve"> </w:t>
+      </w:r>
+      <w:r>
+        <w:rPr>
+          <w:rStyle w:val="VerbatimChar"/>
+        </w:rPr>
+        <w:t xml:space="preserve">c859acb</w:t>
+      </w:r>
+      <w:r>
+        <w:t xml:space="preserve">,</w:t>
+      </w:r>
+      <w:r>
+        <w:t xml:space="preserve"> </w:t>
+      </w:r>
+      <w:r>
+        <w:rPr>
+          <w:rStyle w:val="VerbatimChar"/>
+        </w:rPr>
+        <w:t xml:space="preserve">e303f40</w:t>
+      </w:r>
+      <w:r>
+        <w:t xml:space="preserve">.</w:t>
+      </w:r>
+      <w:r>
+        <w:t xml:space="preserve"> </w:t>
+      </w:r>
+      <w:r>
+        <w:rPr>
+          <w:b/>
+        </w:rPr>
+        <w:t xml:space="preserve">Technology:</w:t>
+      </w:r>
+      <w:r>
+        <w:t xml:space="preserve"> </w:t>
+      </w:r>
+      <w:r>
+        <w:t xml:space="preserve">Git repository reorganization, Python service layout, React app placement, README/docs.</w:t>
+      </w:r>
+    </w:p>
+    <w:p>
+      <w:pPr>
+        <w:pStyle w:val="BodyText"/>
+      </w:pPr>
+      <w:r>
+        <w:t xml:space="preserve">What was done:</w:t>
+      </w:r>
+    </w:p>
+    <w:p>
+      <w:pPr>
+        <w:numPr>
+          <w:ilvl w:val="0"/>
+          <w:numId w:val="1027"/>
+        </w:numPr>
+        <w:pStyle w:val="Compact"/>
+      </w:pPr>
+      <w:r>
+        <w:t xml:space="preserve">Imported the prior Tubitak/OpenNutri codebase snapshot into the current repository.</w:t>
+      </w:r>
+    </w:p>
+    <w:p>
+      <w:pPr>
+        <w:numPr>
+          <w:ilvl w:val="0"/>
+          <w:numId w:val="1027"/>
+        </w:numPr>
+        <w:pStyle w:val="Compact"/>
+      </w:pPr>
+      <w:r>
+        <w:t xml:space="preserve">Preserved a Vercel production frontend build under</w:t>
+      </w:r>
+      <w:r>
+        <w:t xml:space="preserve"> </w:t>
+      </w:r>
+      <w:r>
+        <w:rPr>
+          <w:rStyle w:val="VerbatimChar"/>
+        </w:rPr>
+        <w:t xml:space="preserve">legacy/</w:t>
+      </w:r>
+      <w:r>
+        <w:t xml:space="preserve"> </w:t>
+      </w:r>
+      <w:r>
+        <w:t xml:space="preserve">for recovery.</w:t>
+      </w:r>
+    </w:p>
+    <w:p>
+      <w:pPr>
+        <w:numPr>
+          <w:ilvl w:val="0"/>
+          <w:numId w:val="1027"/>
+        </w:numPr>
+        <w:pStyle w:val="Compact"/>
+      </w:pPr>
+      <w:r>
+        <w:t xml:space="preserve">Reorganized crawler files under</w:t>
+      </w:r>
+      <w:r>
+        <w:t xml:space="preserve"> </w:t>
+      </w:r>
+      <w:r>
+        <w:rPr>
+          <w:rStyle w:val="VerbatimChar"/>
+        </w:rPr>
+        <w:t xml:space="preserve">services/data-pipeline/</w:t>
+      </w:r>
+      <w:r>
+        <w:t xml:space="preserve">.</w:t>
+      </w:r>
+    </w:p>
+    <w:p>
+      <w:pPr>
+        <w:numPr>
+          <w:ilvl w:val="0"/>
+          <w:numId w:val="1027"/>
+        </w:numPr>
+        <w:pStyle w:val="Compact"/>
+      </w:pPr>
+      <w:r>
+        <w:t xml:space="preserve">Added a README and clarified repo structure.</w:t>
+      </w:r>
+    </w:p>
+    <w:p>
+      <w:pPr>
+        <w:numPr>
+          <w:ilvl w:val="0"/>
+          <w:numId w:val="1027"/>
+        </w:numPr>
+        <w:pStyle w:val="Compact"/>
+      </w:pPr>
+      <w:r>
+        <w:t xml:space="preserve">Ignored local keys.</w:t>
+      </w:r>
+    </w:p>
+    <w:p>
+      <w:pPr>
+        <w:pStyle w:val="FirstParagraph"/>
+      </w:pPr>
+      <w:r>
+        <w:t xml:space="preserve">Why it was needed:</w:t>
+      </w:r>
+    </w:p>
+    <w:p>
+      <w:pPr>
+        <w:pStyle w:val="BodyText"/>
+      </w:pPr>
+      <w:r>
+        <w:t xml:space="preserve">The project needed a stable shared repository rather than scattered local/private code. Reorganization made the active surfaces clear: expert annotator app, Python data pipeline, SQL schema, docs, and legacy archive.</w:t>
+      </w:r>
+    </w:p>
+    <w:p>
+      <w:pPr>
+        <w:pStyle w:val="BodyText"/>
+      </w:pPr>
+      <w:r>
+        <w:t xml:space="preserve">How it was implemented:</w:t>
+      </w:r>
+    </w:p>
+    <w:p>
+      <w:pPr>
+        <w:numPr>
+          <w:ilvl w:val="0"/>
+          <w:numId w:val="1028"/>
+        </w:numPr>
+        <w:pStyle w:val="Compact"/>
+      </w:pPr>
+      <w:r>
+        <w:t xml:space="preserve">Existing code was snapshotted and then split into current service/app directories.</w:t>
+      </w:r>
+    </w:p>
+    <w:p>
+      <w:pPr>
+        <w:numPr>
+          <w:ilvl w:val="0"/>
+          <w:numId w:val="1028"/>
+        </w:numPr>
+        <w:pStyle w:val="Compact"/>
+      </w:pPr>
+      <w:r>
+        <w:t xml:space="preserve">Legacy artifacts were kept for recovery but excluded from normal work.</w:t>
+      </w:r>
+    </w:p>
+    <w:p>
+      <w:pPr>
+        <w:numPr>
+          <w:ilvl w:val="0"/>
+          <w:numId w:val="1028"/>
+        </w:numPr>
+        <w:pStyle w:val="Compact"/>
+      </w:pPr>
+      <w:r>
+        <w:t xml:space="preserve">README and later AGENTS files documented which areas future agents should touch.</w:t>
+      </w:r>
+    </w:p>
+    <w:p>
+      <w:pPr>
+        <w:pStyle w:val="FirstParagraph"/>
+      </w:pPr>
+      <w:r>
+        <w:t xml:space="preserve">Caveat:</w:t>
+      </w:r>
+    </w:p>
+    <w:p>
+      <w:pPr>
+        <w:pStyle w:val="BodyText"/>
+      </w:pPr>
+      <w:r>
+        <w:t xml:space="preserve">The snapshot imported earlier work. This report treats later active development separately from the imported foundation.</w:t>
+      </w:r>
+    </w:p>
+    <w:p>
+      <w:pPr>
+        <w:pStyle w:val="Heading3"/>
+      </w:pPr>
+      <w:bookmarkStart w:id="32" w:name="b.-usda-and-reference-data-layer"/>
+      <w:r>
+        <w:t xml:space="preserve">B. USDA and Reference Data Layer</w:t>
+      </w:r>
+      <w:bookmarkEnd w:id="32"/>
+    </w:p>
+    <w:p>
+      <w:pPr>
+        <w:pStyle w:val="FirstParagraph"/>
+      </w:pPr>
+      <w:r>
+        <w:rPr>
+          <w:b/>
+        </w:rPr>
+        <w:t xml:space="preserve">When:</w:t>
+      </w:r>
+      <w:r>
+        <w:t xml:space="preserve"> </w:t>
+      </w:r>
+      <w:r>
+        <w:t xml:space="preserve">March 2026 baseline and later schema integration.</w:t>
+      </w:r>
+      <w:r>
+        <w:t xml:space="preserve"> </w:t>
+      </w:r>
+      <w:r>
+        <w:rPr>
+          <w:b/>
+        </w:rPr>
+        <w:t xml:space="preserve">Technology:</w:t>
+      </w:r>
+      <w:r>
+        <w:t xml:space="preserve"> </w:t>
+      </w:r>
+      <w:r>
+        <w:t xml:space="preserve">Python ETL, Supabase/Postgres, USDA FoodData Central CSVs, SQL reference tables.</w:t>
+      </w:r>
+    </w:p>
+    <w:p>
+      <w:pPr>
+        <w:pStyle w:val="BodyText"/>
+      </w:pPr>
+      <w:r>
+        <w:t xml:space="preserve">What was done:</w:t>
+      </w:r>
+    </w:p>
+    <w:p>
+      <w:pPr>
+        <w:numPr>
+          <w:ilvl w:val="0"/>
+          <w:numId w:val="1029"/>
+        </w:numPr>
+        <w:pStyle w:val="Compact"/>
+      </w:pPr>
+      <w:r>
+        <w:t xml:space="preserve">Retained USDA FoodData Central CSV dumps as source/reference data.</w:t>
+      </w:r>
+    </w:p>
+    <w:p>
+      <w:pPr>
+        <w:numPr>
+          <w:ilvl w:val="0"/>
+          <w:numId w:val="1029"/>
+        </w:numPr>
+        <w:pStyle w:val="Compact"/>
+      </w:pPr>
+      <w:r>
+        <w:t xml:space="preserve">Added ETL scripts for SR Legacy and USDA-to-OpenNutri conversion.</w:t>
+      </w:r>
+    </w:p>
+    <w:p>
+      <w:pPr>
+        <w:numPr>
+          <w:ilvl w:val="0"/>
+          <w:numId w:val="1029"/>
+        </w:numPr>
+        <w:pStyle w:val="Compact"/>
+      </w:pPr>
+      <w:r>
+        <w:t xml:space="preserve">Defined canonical</w:t>
+      </w:r>
+      <w:r>
+        <w:t xml:space="preserve"> </w:t>
+      </w:r>
+      <w:r>
+        <w:rPr>
+          <w:rStyle w:val="VerbatimChar"/>
+        </w:rPr>
+        <w:t xml:space="preserve">entities</w:t>
+      </w:r>
+      <w:r>
+        <w:t xml:space="preserve">,</w:t>
+      </w:r>
+      <w:r>
+        <w:t xml:space="preserve"> </w:t>
+      </w:r>
+      <w:r>
+        <w:rPr>
+          <w:rStyle w:val="VerbatimChar"/>
+        </w:rPr>
+        <w:t xml:space="preserve">entity_aliases</w:t>
+      </w:r>
+      <w:r>
+        <w:t xml:space="preserve">,</w:t>
+      </w:r>
+      <w:r>
+        <w:t xml:space="preserve"> </w:t>
+      </w:r>
+      <w:r>
+        <w:rPr>
+          <w:rStyle w:val="VerbatimChar"/>
+        </w:rPr>
+        <w:t xml:space="preserve">master_nutrients</w:t>
+      </w:r>
+      <w:r>
+        <w:t xml:space="preserve">,</w:t>
+      </w:r>
+      <w:r>
+        <w:t xml:space="preserve"> </w:t>
+      </w:r>
+      <w:r>
+        <w:rPr>
+          <w:rStyle w:val="VerbatimChar"/>
+        </w:rPr>
+        <w:t xml:space="preserve">sources</w:t>
+      </w:r>
+      <w:r>
+        <w:t xml:space="preserve">, and</w:t>
+      </w:r>
+      <w:r>
+        <w:t xml:space="preserve"> </w:t>
+      </w:r>
+      <w:r>
+        <w:rPr>
+          <w:rStyle w:val="VerbatimChar"/>
+        </w:rPr>
+        <w:t xml:space="preserve">claims</w:t>
+      </w:r>
+      <w:r>
+        <w:t xml:space="preserve">.</w:t>
+      </w:r>
+    </w:p>
+    <w:p>
+      <w:pPr>
+        <w:pStyle w:val="FirstParagraph"/>
+      </w:pPr>
+      <w:r>
+        <w:t xml:space="preserve">Why it was needed:</w:t>
+      </w:r>
+    </w:p>
+    <w:p>
+      <w:pPr>
+        <w:pStyle w:val="BodyText"/>
+      </w:pPr>
+      <w:r>
+        <w:t xml:space="preserve">AI and human labelers need stable IDs for known foods and nutrients. Without a canonical reference layer, every paper would create uncontrolled strings and the database would not be useful for nutrition applications.</w:t>
+      </w:r>
+    </w:p>
+    <w:p>
+      <w:pPr>
+        <w:pStyle w:val="BodyText"/>
+      </w:pPr>
+      <w:r>
+        <w:t xml:space="preserve">How it was implemented:</w:t>
+      </w:r>
+    </w:p>
+    <w:p>
+      <w:pPr>
+        <w:numPr>
+          <w:ilvl w:val="0"/>
+          <w:numId w:val="1030"/>
+        </w:numPr>
+        <w:pStyle w:val="Compact"/>
+      </w:pPr>
+      <w:r>
+        <w:t xml:space="preserve">ETL scripts map external USDA rows into OpenNutri’s reference schema.</w:t>
+      </w:r>
+    </w:p>
+    <w:p>
+      <w:pPr>
+        <w:numPr>
+          <w:ilvl w:val="0"/>
+          <w:numId w:val="1030"/>
+        </w:numPr>
+        <w:pStyle w:val="Compact"/>
+      </w:pPr>
+      <w:r>
+        <w:t xml:space="preserve">The annotator can select canonical foods/nutrients or mark custom entries when a paper reports something not yet in the reference set.</w:t>
+      </w:r>
+    </w:p>
+    <w:p>
+      <w:pPr>
+        <w:numPr>
+          <w:ilvl w:val="0"/>
+          <w:numId w:val="1030"/>
+        </w:numPr>
+        <w:pStyle w:val="Compact"/>
+      </w:pPr>
+      <w:r>
+        <w:t xml:space="preserve">Claims store normalized</w:t>
+      </w:r>
+      <w:r>
+        <w:t xml:space="preserve"> </w:t>
+      </w:r>
+      <w:r>
+        <w:rPr>
+          <w:rStyle w:val="VerbatimChar"/>
+        </w:rPr>
+        <w:t xml:space="preserve">entity x nutrient x source</w:t>
+      </w:r>
+      <w:r>
+        <w:t xml:space="preserve"> </w:t>
+      </w:r>
+      <w:r>
+        <w:t xml:space="preserve">facts with amount, unit, basis, confidence, and provenance.</w:t>
+      </w:r>
+    </w:p>
+    <w:p>
+      <w:pPr>
+        <w:pStyle w:val="FirstParagraph"/>
+      </w:pPr>
+      <w:r>
+        <w:t xml:space="preserve">Evidence:</w:t>
+      </w:r>
+    </w:p>
+    <w:p>
+      <w:pPr>
+        <w:numPr>
+          <w:ilvl w:val="0"/>
+          <w:numId w:val="1031"/>
+        </w:numPr>
+        <w:pStyle w:val="Compact"/>
+      </w:pPr>
+      <w:r>
+        <w:rPr>
+          <w:rStyle w:val="VerbatimChar"/>
+        </w:rPr>
+        <w:t xml:space="preserve">etl_sr_legacy_to_opennutri.py</w:t>
+      </w:r>
+    </w:p>
+    <w:p>
+      <w:pPr>
+        <w:numPr>
+          <w:ilvl w:val="0"/>
+          <w:numId w:val="1031"/>
+        </w:numPr>
+        <w:pStyle w:val="Compact"/>
+      </w:pPr>
+      <w:r>
+        <w:rPr>
+          <w:rStyle w:val="VerbatimChar"/>
+        </w:rPr>
+        <w:t xml:space="preserve">etl_usda_to_opennutri.py</w:t>
+      </w:r>
+    </w:p>
+    <w:p>
+      <w:pPr>
+        <w:numPr>
+          <w:ilvl w:val="0"/>
+          <w:numId w:val="1031"/>
+        </w:numPr>
+        <w:pStyle w:val="Compact"/>
+      </w:pPr>
+      <w:r>
+        <w:rPr>
+          <w:rStyle w:val="VerbatimChar"/>
+        </w:rPr>
+        <w:t xml:space="preserve">create_opennutri_schema.sql</w:t>
+      </w:r>
+    </w:p>
+    <w:p>
+      <w:pPr>
+        <w:numPr>
+          <w:ilvl w:val="0"/>
+          <w:numId w:val="1031"/>
+        </w:numPr>
+        <w:pStyle w:val="Compact"/>
+      </w:pPr>
+      <w:r>
+        <w:rPr>
+          <w:rStyle w:val="VerbatimChar"/>
+        </w:rPr>
+        <w:t xml:space="preserve">migration.sql</w:t>
+      </w:r>
+      <w:r>
+        <w:t xml:space="preserve"> </w:t>
+      </w:r>
+      <w:r>
+        <w:t xml:space="preserve">reference table definitions.</w:t>
+      </w:r>
+    </w:p>
+    <w:p>
+      <w:pPr>
+        <w:pStyle w:val="Heading3"/>
+      </w:pPr>
+      <w:bookmarkStart w:id="33" w:name="c.-reviewer-workflow-generations"/>
+      <w:r>
+        <w:t xml:space="preserve">C. Reviewer Workflow Generations</w:t>
+      </w:r>
+      <w:bookmarkEnd w:id="33"/>
+    </w:p>
+    <w:p>
+      <w:pPr>
+        <w:pStyle w:val="FirstParagraph"/>
+      </w:pPr>
+      <w:r>
+        <w:rPr>
+          <w:b/>
+        </w:rPr>
+        <w:t xml:space="preserve">When:</w:t>
+      </w:r>
+      <w:r>
+        <w:t xml:space="preserve"> </w:t>
+      </w:r>
+      <w:r>
+        <w:t xml:space="preserve">April to May 2026.</w:t>
+      </w:r>
+      <w:r>
+        <w:t xml:space="preserve"> </w:t>
+      </w:r>
+      <w:r>
+        <w:rPr>
+          <w:b/>
+        </w:rPr>
+        <w:t xml:space="preserve">Technology:</w:t>
+      </w:r>
+      <w:r>
+        <w:t xml:space="preserve"> </w:t>
+      </w:r>
+      <w:r>
+        <w:t xml:space="preserve">Supabase schema/RPCs, React views, RLS, JSONB payloads.</w:t>
+      </w:r>
+    </w:p>
+    <w:p>
+      <w:pPr>
+        <w:pStyle w:val="BodyText"/>
+      </w:pPr>
+      <w:r>
+        <w:t xml:space="preserve">What was done:</w:t>
+      </w:r>
+    </w:p>
+    <w:p>
+      <w:pPr>
+        <w:numPr>
+          <w:ilvl w:val="0"/>
+          <w:numId w:val="1032"/>
+        </w:numPr>
+        <w:pStyle w:val="Compact"/>
+      </w:pPr>
+      <w:r>
+        <w:t xml:space="preserve">Assignment/slot workflow:</w:t>
+      </w:r>
+    </w:p>
+    <w:p>
+      <w:pPr>
+        <w:numPr>
+          <w:ilvl w:val="1"/>
+          <w:numId w:val="1033"/>
+        </w:numPr>
+        <w:pStyle w:val="Compact"/>
+      </w:pPr>
+      <w:r>
+        <w:t xml:space="preserve">Reviewer slots.</w:t>
+      </w:r>
+    </w:p>
+    <w:p>
+      <w:pPr>
+        <w:numPr>
+          <w:ilvl w:val="1"/>
+          <w:numId w:val="1033"/>
+        </w:numPr>
+        <w:pStyle w:val="Compact"/>
+      </w:pPr>
+      <w:r>
+        <w:t xml:space="preserve">Slot memberships.</w:t>
+      </w:r>
+    </w:p>
+    <w:p>
+      <w:pPr>
+        <w:numPr>
+          <w:ilvl w:val="1"/>
+          <w:numId w:val="1033"/>
+        </w:numPr>
+        <w:pStyle w:val="Compact"/>
+      </w:pPr>
+      <w:r>
+        <w:t xml:space="preserve">Paper assignments.</w:t>
+      </w:r>
+    </w:p>
+    <w:p>
+      <w:pPr>
+        <w:numPr>
+          <w:ilvl w:val="1"/>
+          <w:numId w:val="1033"/>
+        </w:numPr>
+        <w:pStyle w:val="Compact"/>
+      </w:pPr>
+      <w:r>
+        <w:t xml:space="preserve">User assignment rows.</w:t>
+      </w:r>
+    </w:p>
+    <w:p>
+      <w:pPr>
+        <w:numPr>
+          <w:ilvl w:val="1"/>
+          <w:numId w:val="1033"/>
+        </w:numPr>
+        <w:pStyle w:val="Compact"/>
+      </w:pPr>
+      <w:r>
+        <w:t xml:space="preserve">Official/shadow reviewer distinction.</w:t>
+      </w:r>
+    </w:p>
+    <w:p>
+      <w:pPr>
+        <w:numPr>
+          <w:ilvl w:val="0"/>
+          <w:numId w:val="1032"/>
+        </w:numPr>
+        <w:pStyle w:val="Compact"/>
+      </w:pPr>
+      <w:r>
+        <w:t xml:space="preserve">Conflict workflow:</w:t>
+      </w:r>
+    </w:p>
+    <w:p>
+      <w:pPr>
+        <w:numPr>
+          <w:ilvl w:val="1"/>
+          <w:numId w:val="1034"/>
+        </w:numPr>
+        <w:pStyle w:val="Compact"/>
+      </w:pPr>
+      <w:r>
+        <w:t xml:space="preserve">Huan’s conflict tables/view integrated into schema.</w:t>
+      </w:r>
+    </w:p>
+    <w:p>
+      <w:pPr>
+        <w:numPr>
+          <w:ilvl w:val="1"/>
+          <w:numId w:val="1034"/>
+        </w:numPr>
+        <w:pStyle w:val="Compact"/>
+      </w:pPr>
+      <w:r>
+        <w:t xml:space="preserve">Resolution functions retained.</w:t>
+      </w:r>
+    </w:p>
+    <w:p>
+      <w:pPr>
+        <w:numPr>
+          <w:ilvl w:val="0"/>
+          <w:numId w:val="1032"/>
+        </w:numPr>
+        <w:pStyle w:val="Compact"/>
+      </w:pPr>
+      <w:r>
+        <w:t xml:space="preserve">General queue plus approval:</w:t>
+      </w:r>
+    </w:p>
+    <w:p>
+      <w:pPr>
+        <w:numPr>
+          <w:ilvl w:val="1"/>
+          <w:numId w:val="1035"/>
+        </w:numPr>
+        <w:pStyle w:val="Compact"/>
+      </w:pPr>
+      <w:r>
+        <w:t xml:space="preserve">Shared</w:t>
+      </w:r>
+      <w:r>
+        <w:t xml:space="preserve"> </w:t>
+      </w:r>
+      <w:r>
+        <w:rPr>
+          <w:rStyle w:val="VerbatimChar"/>
+        </w:rPr>
+        <w:t xml:space="preserve">human_review_ready</w:t>
+      </w:r>
+      <w:r>
+        <w:t xml:space="preserve"> </w:t>
+      </w:r>
+      <w:r>
+        <w:t xml:space="preserve">queue.</w:t>
+      </w:r>
+    </w:p>
+    <w:p>
+      <w:pPr>
+        <w:numPr>
+          <w:ilvl w:val="1"/>
+          <w:numId w:val="1035"/>
+        </w:numPr>
+        <w:pStyle w:val="Compact"/>
+      </w:pPr>
+      <w:r>
+        <w:t xml:space="preserve">Immutable</w:t>
+      </w:r>
+      <w:r>
+        <w:t xml:space="preserve"> </w:t>
+      </w:r>
+      <w:r>
+        <w:rPr>
+          <w:rStyle w:val="VerbatimChar"/>
+        </w:rPr>
+        <w:t xml:space="preserve">paper_label_submissions</w:t>
+      </w:r>
+      <w:r>
+        <w:t xml:space="preserve">.</w:t>
+      </w:r>
+    </w:p>
+    <w:p>
+      <w:pPr>
+        <w:numPr>
+          <w:ilvl w:val="1"/>
+          <w:numId w:val="1035"/>
+        </w:numPr>
+        <w:pStyle w:val="Compact"/>
+      </w:pPr>
+      <w:r>
+        <w:t xml:space="preserve">Reviewer approval and correction.</w:t>
+      </w:r>
+    </w:p>
+    <w:p>
+      <w:pPr>
+        <w:numPr>
+          <w:ilvl w:val="1"/>
+          <w:numId w:val="1035"/>
+        </w:numPr>
+        <w:pStyle w:val="Compact"/>
+      </w:pPr>
+      <w:r>
+        <w:t xml:space="preserve">Final</w:t>
+      </w:r>
+      <w:r>
+        <w:t xml:space="preserve"> </w:t>
+      </w:r>
+      <w:r>
+        <w:rPr>
+          <w:rStyle w:val="VerbatimChar"/>
+        </w:rPr>
+        <w:t xml:space="preserve">paper_review_outcomes</w:t>
+      </w:r>
+      <w:r>
+        <w:t xml:space="preserve">.</w:t>
+      </w:r>
+    </w:p>
+    <w:p>
+      <w:pPr>
+        <w:pStyle w:val="FirstParagraph"/>
+      </w:pPr>
+      <w:r>
+        <w:t xml:space="preserve">Why it changed:</w:t>
+      </w:r>
+    </w:p>
+    <w:p>
+      <w:pPr>
+        <w:pStyle w:val="BodyText"/>
+      </w:pPr>
+      <w:r>
+        <w:t xml:space="preserve">The slot model provided structure but slowed throughput. The general queue made labeling faster: all active labelers see available useful papers, and submission removes a paper from the queue. Approval preserves final truth quality.</w:t>
+      </w:r>
+    </w:p>
+    <w:p>
+      <w:pPr>
+        <w:pStyle w:val="BodyText"/>
+      </w:pPr>
+      <w:r>
+        <w:t xml:space="preserve">How it was implemented:</w:t>
+      </w:r>
+    </w:p>
+    <w:p>
+      <w:pPr>
+        <w:numPr>
+          <w:ilvl w:val="0"/>
+          <w:numId w:val="1036"/>
+        </w:numPr>
+        <w:pStyle w:val="Compact"/>
+      </w:pPr>
+      <w:r>
+        <w:t xml:space="preserve">Arciel kept legacy tables for audit rather than deleting history.</w:t>
+      </w:r>
+    </w:p>
+    <w:p>
+      <w:pPr>
+        <w:numPr>
+          <w:ilvl w:val="0"/>
+          <w:numId w:val="1036"/>
+        </w:numPr>
+        <w:pStyle w:val="Compact"/>
+      </w:pPr>
+      <w:r>
+        <w:rPr>
+          <w:rStyle w:val="VerbatimChar"/>
+        </w:rPr>
+        <w:t xml:space="preserve">get_general_queue_cards</w:t>
+      </w:r>
+      <w:r>
+        <w:t xml:space="preserve"> </w:t>
+      </w:r>
+      <w:r>
+        <w:t xml:space="preserve">encodes visibility rules.</w:t>
+      </w:r>
+    </w:p>
+    <w:p>
+      <w:pPr>
+        <w:numPr>
+          <w:ilvl w:val="0"/>
+          <w:numId w:val="1036"/>
+        </w:numPr>
+        <w:pStyle w:val="Compact"/>
+      </w:pPr>
+      <w:r>
+        <w:rPr>
+          <w:rStyle w:val="VerbatimChar"/>
+        </w:rPr>
+        <w:t xml:space="preserve">submit_general_label</w:t>
+      </w:r>
+      <w:r>
+        <w:t xml:space="preserve"> </w:t>
+      </w:r>
+      <w:r>
+        <w:t xml:space="preserve">freezes a submission and auto-accepts when the caller can approve.</w:t>
+      </w:r>
+    </w:p>
+    <w:p>
+      <w:pPr>
+        <w:numPr>
+          <w:ilvl w:val="0"/>
+          <w:numId w:val="1036"/>
+        </w:numPr>
+        <w:pStyle w:val="Compact"/>
+      </w:pPr>
+      <w:r>
+        <w:rPr>
+          <w:rStyle w:val="VerbatimChar"/>
+        </w:rPr>
+        <w:t xml:space="preserve">approve_label_submission</w:t>
+      </w:r>
+      <w:r>
+        <w:t xml:space="preserve"> </w:t>
+      </w:r>
+      <w:r>
+        <w:t xml:space="preserve">writes correction diff and final outcome.</w:t>
+      </w:r>
+    </w:p>
+    <w:p>
+      <w:pPr>
+        <w:numPr>
+          <w:ilvl w:val="0"/>
+          <w:numId w:val="1036"/>
+        </w:numPr>
+        <w:pStyle w:val="Compact"/>
+      </w:pPr>
+      <w:r>
+        <w:t xml:space="preserve">Dashboard and feedback learning use approved truth rather than drafts.</w:t>
+      </w:r>
+    </w:p>
+    <w:p>
+      <w:pPr>
+        <w:pStyle w:val="FirstParagraph"/>
+      </w:pPr>
+      <w:r>
+        <w:t xml:space="preserve">Evidence:</w:t>
+      </w:r>
+    </w:p>
+    <w:p>
+      <w:pPr>
+        <w:numPr>
+          <w:ilvl w:val="0"/>
+          <w:numId w:val="1037"/>
+        </w:numPr>
+        <w:pStyle w:val="Compact"/>
+      </w:pPr>
+      <w:r>
+        <w:rPr>
+          <w:rStyle w:val="VerbatimChar"/>
+        </w:rPr>
+        <w:t xml:space="preserve">migration.sql</w:t>
+      </w:r>
+      <w:r>
+        <w:t xml:space="preserve">: legacy and current workflow tables.</w:t>
+      </w:r>
+    </w:p>
+    <w:p>
+      <w:pPr>
+        <w:numPr>
+          <w:ilvl w:val="0"/>
+          <w:numId w:val="1037"/>
+        </w:numPr>
+        <w:pStyle w:val="Compact"/>
+      </w:pPr>
+      <w:r>
+        <w:rPr>
+          <w:rStyle w:val="VerbatimChar"/>
+        </w:rPr>
+        <w:t xml:space="preserve">docs/reviewer_workflow_map.md</w:t>
+      </w:r>
+      <w:r>
+        <w:t xml:space="preserve">.</w:t>
+      </w:r>
+    </w:p>
+    <w:p>
+      <w:pPr>
+        <w:numPr>
+          <w:ilvl w:val="0"/>
+          <w:numId w:val="1037"/>
+        </w:numPr>
+        <w:pStyle w:val="Compact"/>
+      </w:pPr>
+      <w:r>
+        <w:rPr>
+          <w:rStyle w:val="VerbatimChar"/>
+        </w:rPr>
+        <w:t xml:space="preserve">README.md</w:t>
+      </w:r>
+      <w:r>
+        <w:t xml:space="preserve"> </w:t>
+      </w:r>
+      <w:r>
+        <w:t xml:space="preserve">reviewer workflow section.</w:t>
+      </w:r>
+    </w:p>
+    <w:p>
+      <w:pPr>
+        <w:pStyle w:val="Heading3"/>
+      </w:pPr>
+      <w:bookmarkStart w:id="34" w:name="d.-ai-normalization-and-routing-details"/>
+      <w:r>
+        <w:t xml:space="preserve">D. AI Normalization and Routing Details</w:t>
+      </w:r>
+      <w:bookmarkEnd w:id="34"/>
+    </w:p>
+    <w:p>
+      <w:pPr>
+        <w:pStyle w:val="FirstParagraph"/>
+      </w:pPr>
+      <w:r>
+        <w:rPr>
+          <w:b/>
+        </w:rPr>
+        <w:t xml:space="preserve">When:</w:t>
+      </w:r>
+      <w:r>
+        <w:t xml:space="preserve"> </w:t>
+      </w:r>
+      <w:r>
+        <w:t xml:space="preserve">April to June 2026.</w:t>
+      </w:r>
+      <w:r>
+        <w:t xml:space="preserve"> </w:t>
+      </w:r>
+      <w:r>
+        <w:rPr>
+          <w:b/>
+        </w:rPr>
+        <w:t xml:space="preserve">Technology:</w:t>
+      </w:r>
+      <w:r>
+        <w:t xml:space="preserve"> </w:t>
+      </w:r>
+      <w:r>
+        <w:t xml:space="preserve">Python dataclasses, JSON, SHA-256, Supabase client, PL/pgSQL support tables.</w:t>
+      </w:r>
+    </w:p>
+    <w:p>
+      <w:pPr>
+        <w:pStyle w:val="BodyText"/>
+      </w:pPr>
+      <w:r>
+        <w:t xml:space="preserve">What was done:</w:t>
+      </w:r>
+    </w:p>
+    <w:p>
+      <w:pPr>
+        <w:numPr>
+          <w:ilvl w:val="0"/>
+          <w:numId w:val="1038"/>
+        </w:numPr>
+        <w:pStyle w:val="Compact"/>
+      </w:pPr>
+      <w:r>
+        <w:t xml:space="preserve">Defined routing statuses and destinations.</w:t>
+      </w:r>
+    </w:p>
+    <w:p>
+      <w:pPr>
+        <w:numPr>
+          <w:ilvl w:val="0"/>
+          <w:numId w:val="1038"/>
+        </w:numPr>
+        <w:pStyle w:val="Compact"/>
+      </w:pPr>
+      <w:r>
+        <w:t xml:space="preserve">Classified high/low positive/negative buckets.</w:t>
+      </w:r>
+    </w:p>
+    <w:p>
+      <w:pPr>
+        <w:numPr>
+          <w:ilvl w:val="0"/>
+          <w:numId w:val="1038"/>
+        </w:numPr>
+        <w:pStyle w:val="Compact"/>
+      </w:pPr>
+      <w:r>
+        <w:t xml:space="preserve">Implemented deterministic audit sampling.</w:t>
+      </w:r>
+    </w:p>
+    <w:p>
+      <w:pPr>
+        <w:numPr>
+          <w:ilvl w:val="0"/>
+          <w:numId w:val="1038"/>
+        </w:numPr>
+        <w:pStyle w:val="Compact"/>
+      </w:pPr>
+      <w:r>
+        <w:t xml:space="preserve">Implemented AI normalized payload generation.</w:t>
+      </w:r>
+    </w:p>
+    <w:p>
+      <w:pPr>
+        <w:numPr>
+          <w:ilvl w:val="0"/>
+          <w:numId w:val="1038"/>
+        </w:numPr>
+        <w:pStyle w:val="Compact"/>
+      </w:pPr>
+      <w:r>
+        <w:t xml:space="preserve">Implemented supported unit/basis policy.</w:t>
+      </w:r>
+    </w:p>
+    <w:p>
+      <w:pPr>
+        <w:numPr>
+          <w:ilvl w:val="0"/>
+          <w:numId w:val="1038"/>
+        </w:numPr>
+        <w:pStyle w:val="Compact"/>
+      </w:pPr>
+      <w:r>
+        <w:t xml:space="preserve">Implemented food/nutrient ID verification and exact/alias fallback.</w:t>
+      </w:r>
+    </w:p>
+    <w:p>
+      <w:pPr>
+        <w:numPr>
+          <w:ilvl w:val="0"/>
+          <w:numId w:val="1038"/>
+        </w:numPr>
+        <w:pStyle w:val="Compact"/>
+      </w:pPr>
+      <w:r>
+        <w:t xml:space="preserve">Stored normalization summary and rejection histogram.</w:t>
+      </w:r>
+    </w:p>
+    <w:p>
+      <w:pPr>
+        <w:numPr>
+          <w:ilvl w:val="0"/>
+          <w:numId w:val="1038"/>
+        </w:numPr>
+        <w:pStyle w:val="Compact"/>
+      </w:pPr>
+      <w:r>
+        <w:t xml:space="preserve">Stored threshold snapshots and route decisions.</w:t>
+      </w:r>
+    </w:p>
+    <w:p>
+      <w:pPr>
+        <w:pStyle w:val="FirstParagraph"/>
+      </w:pPr>
+      <w:r>
+        <w:t xml:space="preserve">Why it was needed:</w:t>
+      </w:r>
+    </w:p>
+    <w:p>
+      <w:pPr>
+        <w:pStyle w:val="BodyText"/>
+      </w:pPr>
+      <w:r>
+        <w:t xml:space="preserve">The model’s raw output is not trustworthy database data. It must be converted into the same normalized structure a human reviewer would submit, and the system must record why rows were rejected.</w:t>
+      </w:r>
+    </w:p>
+    <w:p>
+      <w:pPr>
+        <w:pStyle w:val="BodyText"/>
+      </w:pPr>
+      <w:r>
+        <w:t xml:space="preserve">How it was implemented:</w:t>
+      </w:r>
+    </w:p>
+    <w:p>
+      <w:pPr>
+        <w:numPr>
+          <w:ilvl w:val="0"/>
+          <w:numId w:val="1039"/>
+        </w:numPr>
+        <w:pStyle w:val="Compact"/>
+      </w:pPr>
+      <w:r>
+        <w:rPr>
+          <w:rStyle w:val="VerbatimChar"/>
+        </w:rPr>
+        <w:t xml:space="preserve">normalize_ai_payload_with_summary</w:t>
+      </w:r>
+      <w:r>
+        <w:t xml:space="preserve"> </w:t>
+      </w:r>
+      <w:r>
+        <w:t xml:space="preserve">iterates model rows, drops incomplete rows, standardizes units, resolves references, groups by food, sorts deterministically, and returns counts.</w:t>
+      </w:r>
+    </w:p>
+    <w:p>
+      <w:pPr>
+        <w:numPr>
+          <w:ilvl w:val="0"/>
+          <w:numId w:val="1039"/>
+        </w:numPr>
+        <w:pStyle w:val="Compact"/>
+      </w:pPr>
+      <w:r>
+        <w:rPr>
+          <w:rStyle w:val="VerbatimChar"/>
+        </w:rPr>
+        <w:t xml:space="preserve">_standardize_unit</w:t>
+      </w:r>
+      <w:r>
+        <w:t xml:space="preserve"> </w:t>
+      </w:r>
+      <w:r>
+        <w:t xml:space="preserve">accepts only supported units such as</w:t>
+      </w:r>
+      <w:r>
+        <w:t xml:space="preserve"> </w:t>
+      </w:r>
+      <w:r>
+        <w:rPr>
+          <w:rStyle w:val="VerbatimChar"/>
+        </w:rPr>
+        <w:t xml:space="preserve">g/100g</w:t>
+      </w:r>
+      <w:r>
+        <w:t xml:space="preserve">,</w:t>
+      </w:r>
+      <w:r>
+        <w:t xml:space="preserve"> </w:t>
+      </w:r>
+      <w:r>
+        <w:rPr>
+          <w:rStyle w:val="VerbatimChar"/>
+        </w:rPr>
+        <w:t xml:space="preserve">mg/100g</w:t>
+      </w:r>
+      <w:r>
+        <w:t xml:space="preserve">,</w:t>
+      </w:r>
+      <w:r>
+        <w:t xml:space="preserve"> </w:t>
+      </w:r>
+      <w:r>
+        <w:rPr>
+          <w:rStyle w:val="VerbatimChar"/>
+        </w:rPr>
+        <w:t xml:space="preserve">ug/100g</w:t>
+      </w:r>
+      <w:r>
+        <w:t xml:space="preserve">, energy units, IU, and percent.</w:t>
+      </w:r>
+    </w:p>
+    <w:p>
+      <w:pPr>
+        <w:numPr>
+          <w:ilvl w:val="0"/>
+          <w:numId w:val="1039"/>
+        </w:numPr>
+        <w:pStyle w:val="Compact"/>
+      </w:pPr>
+      <w:r>
+        <w:t xml:space="preserve">Dry-matter or unsupported bases are rejected so final human/AI payloads stay DB-compliant.</w:t>
+      </w:r>
+    </w:p>
+    <w:p>
+      <w:pPr>
+        <w:numPr>
+          <w:ilvl w:val="0"/>
+          <w:numId w:val="1039"/>
+        </w:numPr>
+        <w:pStyle w:val="Compact"/>
+      </w:pPr>
+      <w:r>
+        <w:rPr>
+          <w:rStyle w:val="VerbatimChar"/>
+        </w:rPr>
+        <w:t xml:space="preserve">PayloadNormalizationResult.summary</w:t>
+      </w:r>
+      <w:r>
+        <w:t xml:space="preserve"> </w:t>
+      </w:r>
+      <w:r>
+        <w:t xml:space="preserve">feeds cockpit AI details and debugging.</w:t>
+      </w:r>
+    </w:p>
+    <w:p>
+      <w:pPr>
+        <w:pStyle w:val="FirstParagraph"/>
+      </w:pPr>
+      <w:r>
+        <w:t xml:space="preserve">Evidence:</w:t>
+      </w:r>
+    </w:p>
+    <w:p>
+      <w:pPr>
+        <w:numPr>
+          <w:ilvl w:val="0"/>
+          <w:numId w:val="1040"/>
+        </w:numPr>
+        <w:pStyle w:val="Compact"/>
+      </w:pPr>
+      <w:r>
+        <w:rPr>
+          <w:rStyle w:val="VerbatimChar"/>
+        </w:rPr>
+        <w:t xml:space="preserve">ai_routing.py</w:t>
+      </w:r>
+      <w:r>
+        <w:t xml:space="preserve">: 842 lines.</w:t>
+      </w:r>
+    </w:p>
+    <w:p>
+      <w:pPr>
+        <w:numPr>
+          <w:ilvl w:val="0"/>
+          <w:numId w:val="1040"/>
+        </w:numPr>
+        <w:pStyle w:val="Compact"/>
+      </w:pPr>
+      <w:r>
+        <w:rPr>
+          <w:rStyle w:val="VerbatimChar"/>
+        </w:rPr>
+        <w:t xml:space="preserve">test_ai_routing.py</w:t>
+      </w:r>
+      <w:r>
+        <w:t xml:space="preserve">: 2,469 lines.</w:t>
+      </w:r>
+    </w:p>
+    <w:p>
+      <w:pPr>
+        <w:pStyle w:val="Heading3"/>
+      </w:pPr>
+      <w:bookmarkStart w:id="35" w:name="e.-model-worker-reliability"/>
+      <w:r>
+        <w:t xml:space="preserve">E. Model Worker Reliability</w:t>
+      </w:r>
+      <w:bookmarkEnd w:id="35"/>
+    </w:p>
+    <w:p>
+      <w:pPr>
+        <w:pStyle w:val="FirstParagraph"/>
+      </w:pPr>
+      <w:r>
+        <w:rPr>
+          <w:b/>
+        </w:rPr>
+        <w:t xml:space="preserve">When:</w:t>
+      </w:r>
+      <w:r>
+        <w:t xml:space="preserve"> </w:t>
+      </w:r>
+      <w:r>
+        <w:t xml:space="preserve">May 2026, hardened repeatedly.</w:t>
+      </w:r>
+      <w:r>
+        <w:t xml:space="preserve"> </w:t>
+      </w:r>
+      <w:r>
+        <w:rPr>
+          <w:b/>
+        </w:rPr>
+        <w:t xml:space="preserve">Technology:</w:t>
+      </w:r>
+      <w:r>
+        <w:t xml:space="preserve"> </w:t>
+      </w:r>
+      <w:r>
+        <w:t xml:space="preserve">Python CLI, Unix alarms/timeouts, Supabase RPCs, subprocess</w:t>
+      </w:r>
+      <w:r>
+        <w:t xml:space="preserve"> </w:t>
+      </w:r>
+      <w:r>
+        <w:rPr>
+          <w:rStyle w:val="VerbatimChar"/>
+        </w:rPr>
+        <w:t xml:space="preserve">pdftotext</w:t>
+      </w:r>
+      <w:r>
+        <w:t xml:space="preserve">, model SDK calls.</w:t>
+      </w:r>
+    </w:p>
+    <w:p>
+      <w:pPr>
+        <w:pStyle w:val="BodyText"/>
+      </w:pPr>
+      <w:r>
+        <w:t xml:space="preserve">What was done:</w:t>
+      </w:r>
+    </w:p>
+    <w:p>
+      <w:pPr>
+        <w:numPr>
+          <w:ilvl w:val="0"/>
+          <w:numId w:val="1041"/>
+        </w:numPr>
+        <w:pStyle w:val="Compact"/>
+      </w:pPr>
+      <w:r>
+        <w:t xml:space="preserve">Model runtime validation before task claiming.</w:t>
+      </w:r>
+    </w:p>
+    <w:p>
+      <w:pPr>
+        <w:numPr>
+          <w:ilvl w:val="0"/>
+          <w:numId w:val="1041"/>
+        </w:numPr>
+        <w:pStyle w:val="Compact"/>
+      </w:pPr>
+      <w:r>
+        <w:t xml:space="preserve">Atomic task claiming.</w:t>
+      </w:r>
+    </w:p>
+    <w:p>
+      <w:pPr>
+        <w:numPr>
+          <w:ilvl w:val="0"/>
+          <w:numId w:val="1041"/>
+        </w:numPr>
+        <w:pStyle w:val="Compact"/>
+      </w:pPr>
+      <w:r>
+        <w:t xml:space="preserve">Stale processing requeue.</w:t>
+      </w:r>
+    </w:p>
+    <w:p>
+      <w:pPr>
+        <w:numPr>
+          <w:ilvl w:val="0"/>
+          <w:numId w:val="1041"/>
+        </w:numPr>
+        <w:pStyle w:val="Compact"/>
+      </w:pPr>
+      <w:r>
+        <w:t xml:space="preserve">Claim attempt accounting.</w:t>
+      </w:r>
+    </w:p>
+    <w:p>
+      <w:pPr>
+        <w:numPr>
+          <w:ilvl w:val="0"/>
+          <w:numId w:val="1041"/>
+        </w:numPr>
+        <w:pStyle w:val="Compact"/>
+      </w:pPr>
+      <w:r>
+        <w:t xml:space="preserve">Quota-safe requeue.</w:t>
+      </w:r>
+    </w:p>
+    <w:p>
+      <w:pPr>
+        <w:numPr>
+          <w:ilvl w:val="0"/>
+          <w:numId w:val="1041"/>
+        </w:numPr>
+        <w:pStyle w:val="Compact"/>
+      </w:pPr>
+      <w:r>
+        <w:t xml:space="preserve">Retryable/non-retryable error classification.</w:t>
+      </w:r>
+    </w:p>
+    <w:p>
+      <w:pPr>
+        <w:numPr>
+          <w:ilvl w:val="0"/>
+          <w:numId w:val="1041"/>
+        </w:numPr>
+        <w:pStyle w:val="Compact"/>
+      </w:pPr>
+      <w:r>
+        <w:t xml:space="preserve">Same-attempt fallback model use.</w:t>
+      </w:r>
+    </w:p>
+    <w:p>
+      <w:pPr>
+        <w:numPr>
+          <w:ilvl w:val="0"/>
+          <w:numId w:val="1041"/>
+        </w:numPr>
+        <w:pStyle w:val="Compact"/>
+      </w:pPr>
+      <w:r>
+        <w:t xml:space="preserve">Timeout around model calls.</w:t>
+      </w:r>
+    </w:p>
+    <w:p>
+      <w:pPr>
+        <w:numPr>
+          <w:ilvl w:val="0"/>
+          <w:numId w:val="1041"/>
+        </w:numPr>
+        <w:pStyle w:val="Compact"/>
+      </w:pPr>
+      <w:r>
+        <w:t xml:space="preserve">Failure after non-quota retry ceiling.</w:t>
+      </w:r>
+    </w:p>
+    <w:p>
+      <w:pPr>
+        <w:pStyle w:val="FirstParagraph"/>
+      </w:pPr>
+      <w:r>
+        <w:t xml:space="preserve">Why it was needed:</w:t>
+      </w:r>
+    </w:p>
+    <w:p>
+      <w:pPr>
+        <w:pStyle w:val="BodyText"/>
+      </w:pPr>
+      <w:r>
+        <w:t xml:space="preserve">Unattended workers fail in practical ways: missing secrets, timed-out models, cancelled GitHub runners, quota errors, SDK exceptions, and repeatedly bad papers. The queue must recover without losing tasks or letting one paper monopolize automation.</w:t>
+      </w:r>
+    </w:p>
+    <w:p>
+      <w:pPr>
+        <w:pStyle w:val="BodyText"/>
+      </w:pPr>
+      <w:r>
+        <w:t xml:space="preserve">How it was implemented:</w:t>
+      </w:r>
+    </w:p>
+    <w:p>
+      <w:pPr>
+        <w:numPr>
+          <w:ilvl w:val="0"/>
+          <w:numId w:val="1042"/>
+        </w:numPr>
+        <w:pStyle w:val="Compact"/>
+      </w:pPr>
+      <w:r>
+        <w:rPr>
+          <w:rStyle w:val="VerbatimChar"/>
+        </w:rPr>
+        <w:t xml:space="preserve">claim_paper_stage_tasks</w:t>
+      </w:r>
+      <w:r>
+        <w:t xml:space="preserve"> </w:t>
+      </w:r>
+      <w:r>
+        <w:t xml:space="preserve">claims with</w:t>
+      </w:r>
+      <w:r>
+        <w:t xml:space="preserve"> </w:t>
+      </w:r>
+      <w:r>
+        <w:rPr>
+          <w:rStyle w:val="VerbatimChar"/>
+        </w:rPr>
+        <w:t xml:space="preserve">FOR UPDATE SKIP LOCKED</w:t>
+      </w:r>
+      <w:r>
+        <w:t xml:space="preserve">.</w:t>
+      </w:r>
+    </w:p>
+    <w:p>
+      <w:pPr>
+        <w:numPr>
+          <w:ilvl w:val="0"/>
+          <w:numId w:val="1042"/>
+        </w:numPr>
+        <w:pStyle w:val="Compact"/>
+      </w:pPr>
+      <w:r>
+        <w:rPr>
+          <w:rStyle w:val="VerbatimChar"/>
+        </w:rPr>
+        <w:t xml:space="preserve">process_stage_queue.py</w:t>
+      </w:r>
+      <w:r>
+        <w:t xml:space="preserve"> </w:t>
+      </w:r>
+      <w:r>
+        <w:t xml:space="preserve">constructs evaluator before claiming to catch config errors early.</w:t>
+      </w:r>
+    </w:p>
+    <w:p>
+      <w:pPr>
+        <w:numPr>
+          <w:ilvl w:val="0"/>
+          <w:numId w:val="1042"/>
+        </w:numPr>
+        <w:pStyle w:val="Compact"/>
+      </w:pPr>
+      <w:r>
+        <w:rPr>
+          <w:rStyle w:val="VerbatimChar"/>
+        </w:rPr>
+        <w:t xml:space="preserve">requeue_stale_processing_tasks</w:t>
+      </w:r>
+      <w:r>
+        <w:t xml:space="preserve"> </w:t>
+      </w:r>
+      <w:r>
+        <w:t xml:space="preserve">returns old</w:t>
+      </w:r>
+      <w:r>
+        <w:t xml:space="preserve"> </w:t>
+      </w:r>
+      <w:r>
+        <w:rPr>
+          <w:rStyle w:val="VerbatimChar"/>
+        </w:rPr>
+        <w:t xml:space="preserve">processing</w:t>
+      </w:r>
+      <w:r>
+        <w:t xml:space="preserve"> </w:t>
+      </w:r>
+      <w:r>
+        <w:t xml:space="preserve">tasks to</w:t>
+      </w:r>
+      <w:r>
+        <w:t xml:space="preserve"> </w:t>
+      </w:r>
+      <w:r>
+        <w:rPr>
+          <w:rStyle w:val="VerbatimChar"/>
+        </w:rPr>
+        <w:t xml:space="preserve">queued</w:t>
+      </w:r>
+      <w:r>
+        <w:t xml:space="preserve">.</w:t>
+      </w:r>
+    </w:p>
+    <w:p>
+      <w:pPr>
+        <w:numPr>
+          <w:ilvl w:val="0"/>
+          <w:numId w:val="1042"/>
+        </w:numPr>
+        <w:pStyle w:val="Compact"/>
+      </w:pPr>
+      <w:r>
+        <w:t xml:space="preserve">Quota errors decrement/undo meaningful attempt count.</w:t>
+      </w:r>
+    </w:p>
+    <w:p>
+      <w:pPr>
+        <w:numPr>
+          <w:ilvl w:val="0"/>
+          <w:numId w:val="1042"/>
+        </w:numPr>
+        <w:pStyle w:val="Compact"/>
+      </w:pPr>
+      <w:r>
+        <w:t xml:space="preserve">Non-retryable model configuration errors mark the task failed and stop automation.</w:t>
+      </w:r>
+    </w:p>
+    <w:p>
+      <w:pPr>
+        <w:numPr>
+          <w:ilvl w:val="0"/>
+          <w:numId w:val="1042"/>
+        </w:numPr>
+        <w:pStyle w:val="Compact"/>
+      </w:pPr>
+      <w:r>
+        <w:rPr>
+          <w:rStyle w:val="VerbatimChar"/>
+        </w:rPr>
+        <w:t xml:space="preserve">AI_STAGE_MAX_TASK_ATTEMPTS=2</w:t>
+      </w:r>
+      <w:r>
+        <w:t xml:space="preserve"> </w:t>
+      </w:r>
+      <w:r>
+        <w:t xml:space="preserve">prevents endless loops for non-quota failures.</w:t>
+      </w:r>
+    </w:p>
+    <w:p>
+      <w:pPr>
+        <w:pStyle w:val="FirstParagraph"/>
+      </w:pPr>
+      <w:r>
+        <w:t xml:space="preserve">Evidence:</w:t>
+      </w:r>
+    </w:p>
+    <w:p>
+      <w:pPr>
+        <w:numPr>
+          <w:ilvl w:val="0"/>
+          <w:numId w:val="1043"/>
+        </w:numPr>
+        <w:pStyle w:val="Compact"/>
+      </w:pPr>
+      <w:r>
+        <w:rPr>
+          <w:rStyle w:val="VerbatimChar"/>
+        </w:rPr>
+        <w:t xml:space="preserve">process_stage_queue.py</w:t>
+      </w:r>
+      <w:r>
+        <w:t xml:space="preserve">: 1,560 lines.</w:t>
+      </w:r>
+    </w:p>
+    <w:p>
+      <w:pPr>
+        <w:numPr>
+          <w:ilvl w:val="0"/>
+          <w:numId w:val="1043"/>
+        </w:numPr>
+        <w:pStyle w:val="Compact"/>
+      </w:pPr>
+      <w:r>
+        <w:rPr>
+          <w:rStyle w:val="VerbatimChar"/>
+        </w:rPr>
+        <w:t xml:space="preserve">test_daily_ops.py</w:t>
+      </w:r>
+      <w:r>
+        <w:t xml:space="preserve">: 983 lines.</w:t>
+      </w:r>
+    </w:p>
+    <w:p>
+      <w:pPr>
+        <w:numPr>
+          <w:ilvl w:val="0"/>
+          <w:numId w:val="1043"/>
+        </w:numPr>
+        <w:pStyle w:val="Compact"/>
+      </w:pPr>
+      <w:r>
+        <w:t xml:space="preserve">AGENTS/README daily ops notes.</w:t>
+      </w:r>
+    </w:p>
+    <w:p>
+      <w:pPr>
+        <w:pStyle w:val="Heading3"/>
+      </w:pPr>
+      <w:bookmarkStart w:id="36" w:name="f.-three-stage-cascade-rationale"/>
+      <w:r>
+        <w:t xml:space="preserve">F. Three-Stage Cascade Rationale</w:t>
+      </w:r>
+      <w:bookmarkEnd w:id="36"/>
+    </w:p>
+    <w:p>
+      <w:pPr>
+        <w:pStyle w:val="FirstParagraph"/>
+      </w:pPr>
+      <w:r>
+        <w:rPr>
+          <w:b/>
+        </w:rPr>
+        <w:t xml:space="preserve">When:</w:t>
+      </w:r>
+      <w:r>
+        <w:t xml:space="preserve"> </w:t>
+      </w:r>
+      <w:r>
+        <w:t xml:space="preserve">Gemma stage on 2026-05-03; daily ops drain by quota on 2026-05-11; Flash-Lite on 2026-05-29; PDF-mode final Gemini on 2026-05-31.</w:t>
+      </w:r>
+      <w:r>
+        <w:t xml:space="preserve"> </w:t>
+      </w:r>
+      <w:r>
+        <w:rPr>
+          <w:b/>
+        </w:rPr>
+        <w:t xml:space="preserve">Technology:</w:t>
+      </w:r>
+      <w:r>
+        <w:t xml:space="preserve"> </w:t>
+      </w:r>
+      <w:r>
+        <w:t xml:space="preserve">Data-driven stage configs, Gemini/Gemma model calls, PDF/text input modes.</w:t>
+      </w:r>
+    </w:p>
+    <w:p>
+      <w:pPr>
+        <w:pStyle w:val="BodyText"/>
+      </w:pPr>
+      <w:r>
+        <w:t xml:space="preserve">Why not one model:</w:t>
+      </w:r>
+    </w:p>
+    <w:p>
+      <w:pPr>
+        <w:numPr>
+          <w:ilvl w:val="0"/>
+          <w:numId w:val="1044"/>
+        </w:numPr>
+        <w:pStyle w:val="Compact"/>
+      </w:pPr>
+      <w:r>
+        <w:t xml:space="preserve">Strong final Gemini extraction is limited and more valuable.</w:t>
+      </w:r>
+    </w:p>
+    <w:p>
+      <w:pPr>
+        <w:numPr>
+          <w:ilvl w:val="0"/>
+          <w:numId w:val="1044"/>
+        </w:numPr>
+        <w:pStyle w:val="Compact"/>
+      </w:pPr>
+      <w:r>
+        <w:t xml:space="preserve">Screening every candidate with the strongest model would waste quota on mostly-useless papers.</w:t>
+      </w:r>
+    </w:p>
+    <w:p>
+      <w:pPr>
+        <w:numPr>
+          <w:ilvl w:val="0"/>
+          <w:numId w:val="1044"/>
+        </w:numPr>
+        <w:pStyle w:val="Compact"/>
+      </w:pPr>
+      <w:r>
+        <w:t xml:space="preserve">A staged funnel processes many candidates cheaply, then spends expensive calls on the top-ranked subset.</w:t>
+      </w:r>
+    </w:p>
+    <w:p>
+      <w:pPr>
+        <w:pStyle w:val="FirstParagraph"/>
+      </w:pPr>
+      <w:r>
+        <w:t xml:space="preserve">How the cascade works:</w:t>
+      </w:r>
+    </w:p>
+    <w:p>
+      <w:pPr>
+        <w:numPr>
+          <w:ilvl w:val="0"/>
+          <w:numId w:val="1045"/>
+        </w:numPr>
+        <w:pStyle w:val="Compact"/>
+      </w:pPr>
+      <w:r>
+        <w:t xml:space="preserve">Gemma screens many papers/day with page-marked text.</w:t>
+      </w:r>
+    </w:p>
+    <w:p>
+      <w:pPr>
+        <w:numPr>
+          <w:ilvl w:val="0"/>
+          <w:numId w:val="1045"/>
+        </w:numPr>
+        <w:pStyle w:val="Compact"/>
+      </w:pPr>
+      <w:r>
+        <w:t xml:space="preserve">Flash-Lite re-ranks the strongest useful Gemma outputs.</w:t>
+      </w:r>
+    </w:p>
+    <w:p>
+      <w:pPr>
+        <w:numPr>
+          <w:ilvl w:val="0"/>
+          <w:numId w:val="1045"/>
+        </w:numPr>
+        <w:pStyle w:val="Compact"/>
+      </w:pPr>
+      <w:r>
+        <w:t xml:space="preserve">Final Gemini receives native PDF where possible and produces the DB payload.</w:t>
+      </w:r>
+    </w:p>
+    <w:p>
+      <w:pPr>
+        <w:numPr>
+          <w:ilvl w:val="0"/>
+          <w:numId w:val="1045"/>
+        </w:numPr>
+        <w:pStyle w:val="Compact"/>
+      </w:pPr>
+      <w:r>
+        <w:t xml:space="preserve">Each stage writes</w:t>
+      </w:r>
+      <w:r>
+        <w:t xml:space="preserve"> </w:t>
+      </w:r>
+      <w:r>
+        <w:rPr>
+          <w:rStyle w:val="VerbatimChar"/>
+        </w:rPr>
+        <w:t xml:space="preserve">ai_extractions</w:t>
+      </w:r>
+      <w:r>
+        <w:t xml:space="preserve"> </w:t>
+      </w:r>
+      <w:r>
+        <w:t xml:space="preserve">and may enqueue the next</w:t>
+      </w:r>
+      <w:r>
+        <w:t xml:space="preserve"> </w:t>
+      </w:r>
+      <w:r>
+        <w:rPr>
+          <w:rStyle w:val="VerbatimChar"/>
+        </w:rPr>
+        <w:t xml:space="preserve">paper_stage_tasks</w:t>
+      </w:r>
+      <w:r>
+        <w:t xml:space="preserve"> </w:t>
+      </w:r>
+      <w:r>
+        <w:t xml:space="preserve">row.</w:t>
+      </w:r>
+    </w:p>
+    <w:p>
+      <w:pPr>
+        <w:numPr>
+          <w:ilvl w:val="0"/>
+          <w:numId w:val="1045"/>
+        </w:numPr>
+        <w:pStyle w:val="Compact"/>
+      </w:pPr>
+      <w:r>
+        <w:t xml:space="preserve">Stage priority makes downstream tasks top-N by usefulness, not oldest-first.</w:t>
+      </w:r>
+    </w:p>
+    <w:p>
+      <w:pPr>
+        <w:pStyle w:val="FirstParagraph"/>
+      </w:pPr>
+      <w:r>
+        <w:t xml:space="preserve">Why Gemma remains text-mode:</w:t>
+      </w:r>
+    </w:p>
+    <w:p>
+      <w:pPr>
+        <w:numPr>
+          <w:ilvl w:val="0"/>
+          <w:numId w:val="1046"/>
+        </w:numPr>
+        <w:pStyle w:val="Compact"/>
+      </w:pPr>
+      <w:r>
+        <w:t xml:space="preserve">Probe results showed Gemma accepted PDF parts but timed out on a 5-page PDF.</w:t>
+      </w:r>
+    </w:p>
+    <w:p>
+      <w:pPr>
+        <w:numPr>
+          <w:ilvl w:val="0"/>
+          <w:numId w:val="1046"/>
+        </w:numPr>
+        <w:pStyle w:val="Compact"/>
+      </w:pPr>
+      <w:r>
+        <w:t xml:space="preserve">For a high-volume stage, this would collapse throughput.</w:t>
+      </w:r>
+    </w:p>
+    <w:p>
+      <w:pPr>
+        <w:numPr>
+          <w:ilvl w:val="0"/>
+          <w:numId w:val="1046"/>
+        </w:numPr>
+        <w:pStyle w:val="Compact"/>
+      </w:pPr>
+      <w:r>
+        <w:t xml:space="preserve">Text mode with inserted PDF page markers gives adequate page references without image rendering.</w:t>
+      </w:r>
+    </w:p>
+    <w:p>
+      <w:pPr>
+        <w:pStyle w:val="FirstParagraph"/>
+      </w:pPr>
+      <w:r>
+        <w:t xml:space="preserve">Evidence:</w:t>
+      </w:r>
+    </w:p>
+    <w:p>
+      <w:pPr>
+        <w:numPr>
+          <w:ilvl w:val="0"/>
+          <w:numId w:val="1047"/>
+        </w:numPr>
+        <w:pStyle w:val="Compact"/>
+      </w:pPr>
+      <w:r>
+        <w:rPr>
+          <w:rStyle w:val="VerbatimChar"/>
+        </w:rPr>
+        <w:t xml:space="preserve">routing_stage_configs</w:t>
+      </w:r>
+      <w:r>
+        <w:t xml:space="preserve"> </w:t>
+      </w:r>
+      <w:r>
+        <w:t xml:space="preserve">seed/update rows in</w:t>
+      </w:r>
+      <w:r>
+        <w:t xml:space="preserve"> </w:t>
+      </w:r>
+      <w:r>
+        <w:rPr>
+          <w:rStyle w:val="VerbatimChar"/>
+        </w:rPr>
+        <w:t xml:space="preserve">migration.sql</w:t>
+      </w:r>
+      <w:r>
+        <w:t xml:space="preserve">.</w:t>
+      </w:r>
+    </w:p>
+    <w:p>
+      <w:pPr>
+        <w:numPr>
+          <w:ilvl w:val="0"/>
+          <w:numId w:val="1047"/>
+        </w:numPr>
+        <w:pStyle w:val="Compact"/>
+      </w:pPr>
+      <w:r>
+        <w:rPr>
+          <w:rStyle w:val="VerbatimChar"/>
+        </w:rPr>
+        <w:t xml:space="preserve">unified_evaluator.py</w:t>
+      </w:r>
+      <w:r>
+        <w:t xml:space="preserve">.</w:t>
+      </w:r>
+    </w:p>
+    <w:p>
+      <w:pPr>
+        <w:numPr>
+          <w:ilvl w:val="0"/>
+          <w:numId w:val="1047"/>
+        </w:numPr>
+        <w:pStyle w:val="Compact"/>
+      </w:pPr>
+      <w:r>
+        <w:rPr>
+          <w:rStyle w:val="VerbatimChar"/>
+        </w:rPr>
+        <w:t xml:space="preserve">process_stage_queue.py</w:t>
+      </w:r>
+      <w:r>
+        <w:t xml:space="preserve">.</w:t>
+      </w:r>
+    </w:p>
+    <w:p>
+      <w:pPr>
+        <w:numPr>
+          <w:ilvl w:val="0"/>
+          <w:numId w:val="1047"/>
+        </w:numPr>
+        <w:pStyle w:val="Compact"/>
+      </w:pPr>
+      <w:r>
+        <w:rPr>
+          <w:rStyle w:val="VerbatimChar"/>
+        </w:rPr>
+        <w:t xml:space="preserve">probe_model_file_input.py</w:t>
+      </w:r>
+      <w:r>
+        <w:t xml:space="preserve">.</w:t>
+      </w:r>
+    </w:p>
+    <w:p>
+      <w:pPr>
+        <w:pStyle w:val="Heading3"/>
+      </w:pPr>
+      <w:bookmarkStart w:id="37" w:name="g.-crawler-v2-mechanics"/>
+      <w:r>
+        <w:t xml:space="preserve">G. Crawler v2 Mechanics</w:t>
+      </w:r>
+      <w:bookmarkEnd w:id="37"/>
+    </w:p>
+    <w:p>
+      <w:pPr>
+        <w:pStyle w:val="FirstParagraph"/>
+      </w:pPr>
+      <w:r>
+        <w:rPr>
+          <w:b/>
+        </w:rPr>
+        <w:t xml:space="preserve">When:</w:t>
+      </w:r>
+      <w:r>
+        <w:t xml:space="preserve"> </w:t>
+      </w:r>
+      <w:r>
+        <w:t xml:space="preserve">March 2026 onward.</w:t>
+      </w:r>
+      <w:r>
+        <w:t xml:space="preserve"> </w:t>
+      </w:r>
+      <w:r>
+        <w:rPr>
+          <w:b/>
+        </w:rPr>
+        <w:t xml:space="preserve">Technology:</w:t>
+      </w:r>
+      <w:r>
+        <w:t xml:space="preserve"> </w:t>
+      </w:r>
+      <w:r>
+        <w:t xml:space="preserve">Python, Europe PMC/OpenAlex/Semantic Scholar, DergiPark support, urllib/curl, tarfile, PDF validation, embeddings.</w:t>
+      </w:r>
+    </w:p>
+    <w:p>
+      <w:pPr>
+        <w:pStyle w:val="BodyText"/>
+      </w:pPr>
+      <w:r>
+        <w:t xml:space="preserve">What was done:</w:t>
+      </w:r>
+    </w:p>
+    <w:p>
+      <w:pPr>
+        <w:numPr>
+          <w:ilvl w:val="0"/>
+          <w:numId w:val="1048"/>
+        </w:numPr>
+        <w:pStyle w:val="Compact"/>
+      </w:pPr>
+      <w:r>
+        <w:t xml:space="preserve">Built query tasks per source/language.</w:t>
+      </w:r>
+    </w:p>
+    <w:p>
+      <w:pPr>
+        <w:numPr>
+          <w:ilvl w:val="0"/>
+          <w:numId w:val="1048"/>
+        </w:numPr>
+        <w:pStyle w:val="Compact"/>
+      </w:pPr>
+      <w:r>
+        <w:t xml:space="preserve">Built language-specific concept pools.</w:t>
+      </w:r>
+    </w:p>
+    <w:p>
+      <w:pPr>
+        <w:numPr>
+          <w:ilvl w:val="0"/>
+          <w:numId w:val="1048"/>
+        </w:numPr>
+        <w:pStyle w:val="Compact"/>
+      </w:pPr>
+      <w:r>
+        <w:t xml:space="preserve">Added source-term and batch feedback.</w:t>
+      </w:r>
+    </w:p>
+    <w:p>
+      <w:pPr>
+        <w:numPr>
+          <w:ilvl w:val="0"/>
+          <w:numId w:val="1048"/>
+        </w:numPr>
+        <w:pStyle w:val="Compact"/>
+      </w:pPr>
+      <w:r>
+        <w:t xml:space="preserve">Built search gate and metadata decision functions.</w:t>
+      </w:r>
+    </w:p>
+    <w:p>
+      <w:pPr>
+        <w:numPr>
+          <w:ilvl w:val="0"/>
+          <w:numId w:val="1048"/>
+        </w:numPr>
+        <w:pStyle w:val="Compact"/>
+      </w:pPr>
+      <w:r>
+        <w:t xml:space="preserve">Added live Supabase canonical-key skip memory.</w:t>
+      </w:r>
+    </w:p>
+    <w:p>
+      <w:pPr>
+        <w:numPr>
+          <w:ilvl w:val="0"/>
+          <w:numId w:val="1048"/>
+        </w:numPr>
+        <w:pStyle w:val="Compact"/>
+      </w:pPr>
+      <w:r>
+        <w:t xml:space="preserve">Added local terminal paper state.</w:t>
+      </w:r>
+    </w:p>
+    <w:p>
+      <w:pPr>
+        <w:numPr>
+          <w:ilvl w:val="0"/>
+          <w:numId w:val="1048"/>
+        </w:numPr>
+        <w:pStyle w:val="Compact"/>
+      </w:pPr>
+      <w:r>
+        <w:t xml:space="preserve">Added acquisition fallback ladder.</w:t>
+      </w:r>
+    </w:p>
+    <w:p>
+      <w:pPr>
+        <w:numPr>
+          <w:ilvl w:val="0"/>
+          <w:numId w:val="1048"/>
+        </w:numPr>
+        <w:pStyle w:val="Compact"/>
+      </w:pPr>
+      <w:r>
+        <w:t xml:space="preserve">Added audit sampling for rejects.</w:t>
+      </w:r>
+    </w:p>
+    <w:p>
+      <w:pPr>
+        <w:numPr>
+          <w:ilvl w:val="0"/>
+          <w:numId w:val="1048"/>
+        </w:numPr>
+        <w:pStyle w:val="Compact"/>
+      </w:pPr>
+      <w:r>
+        <w:t xml:space="preserve">Added partial output on wall-clock stop.</w:t>
+      </w:r>
+    </w:p>
+    <w:p>
+      <w:pPr>
+        <w:pStyle w:val="FirstParagraph"/>
+      </w:pPr>
+      <w:r>
+        <w:t xml:space="preserve">Why it was needed:</w:t>
+      </w:r>
+    </w:p>
+    <w:p>
+      <w:pPr>
+        <w:pStyle w:val="BodyText"/>
+      </w:pPr>
+      <w:r>
+        <w:t xml:space="preserve">Most papers returned by broad food/nutrition queries are not direct food-composition tables. The crawler must narrow candidates before expensive model/human work, but without hard-rejecting potentially useful papers due to one negative phrase.</w:t>
+      </w:r>
+    </w:p>
+    <w:p>
+      <w:pPr>
+        <w:pStyle w:val="BodyText"/>
+      </w:pPr>
+      <w:r>
+        <w:t xml:space="preserve">How it was implemented:</w:t>
+      </w:r>
+    </w:p>
+    <w:p>
+      <w:pPr>
+        <w:numPr>
+          <w:ilvl w:val="0"/>
+          <w:numId w:val="1049"/>
+        </w:numPr>
+        <w:pStyle w:val="Compact"/>
+      </w:pPr>
+      <w:r>
+        <w:t xml:space="preserve">Additive scoring combines composition phrases, food/nutrient terms, units, methods, embeddings, learned feedback, and soft penalties.</w:t>
+      </w:r>
+    </w:p>
+    <w:p>
+      <w:pPr>
+        <w:numPr>
+          <w:ilvl w:val="0"/>
+          <w:numId w:val="1049"/>
+        </w:numPr>
+        <w:pStyle w:val="Compact"/>
+      </w:pPr>
+      <w:r>
+        <w:rPr>
+          <w:rStyle w:val="VerbatimChar"/>
+        </w:rPr>
+        <w:t xml:space="preserve">validate_pdf_text</w:t>
+      </w:r>
+      <w:r>
+        <w:t xml:space="preserve"> </w:t>
+      </w:r>
+      <w:r>
+        <w:t xml:space="preserve">strips reference sections and requires strong full-text evidence.</w:t>
+      </w:r>
+    </w:p>
+    <w:p>
+      <w:pPr>
+        <w:numPr>
+          <w:ilvl w:val="0"/>
+          <w:numId w:val="1049"/>
+        </w:numPr>
+        <w:pStyle w:val="Compact"/>
+      </w:pPr>
+      <w:r>
+        <w:rPr>
+          <w:rStyle w:val="VerbatimChar"/>
+        </w:rPr>
+        <w:t xml:space="preserve">_fetch_pdf_with_oa</w:t>
+      </w:r>
+      <w:r>
+        <w:t xml:space="preserve"> </w:t>
+      </w:r>
+      <w:r>
+        <w:t xml:space="preserve">tries PMC OA PDFs and tarballs.</w:t>
+      </w:r>
+    </w:p>
+    <w:p>
+      <w:pPr>
+        <w:numPr>
+          <w:ilvl w:val="0"/>
+          <w:numId w:val="1049"/>
+        </w:numPr>
+        <w:pStyle w:val="Compact"/>
+      </w:pPr>
+      <w:r>
+        <w:rPr>
+          <w:rStyle w:val="VerbatimChar"/>
+        </w:rPr>
+        <w:t xml:space="preserve">_fetch_pdf</w:t>
+      </w:r>
+      <w:r>
+        <w:t xml:space="preserve"> </w:t>
+      </w:r>
+      <w:r>
+        <w:t xml:space="preserve">falls back through direct fetch, curl, HTML PDF link scraping, and PMC proof-of-work solving.</w:t>
+      </w:r>
+    </w:p>
+    <w:p>
+      <w:pPr>
+        <w:numPr>
+          <w:ilvl w:val="0"/>
+          <w:numId w:val="1049"/>
+        </w:numPr>
+        <w:pStyle w:val="Compact"/>
+      </w:pPr>
+      <w:r>
+        <w:t xml:space="preserve">Accepted outputs are recorded with reasons and funnel counters.</w:t>
+      </w:r>
+    </w:p>
+    <w:p>
+      <w:pPr>
+        <w:pStyle w:val="FirstParagraph"/>
+      </w:pPr>
+      <w:r>
+        <w:t xml:space="preserve">Evidence:</w:t>
+      </w:r>
+    </w:p>
+    <w:p>
+      <w:pPr>
+        <w:numPr>
+          <w:ilvl w:val="0"/>
+          <w:numId w:val="1050"/>
+        </w:numPr>
+        <w:pStyle w:val="Compact"/>
+      </w:pPr>
+      <w:r>
+        <w:rPr>
+          <w:rStyle w:val="VerbatimChar"/>
+        </w:rPr>
+        <w:t xml:space="preserve">crawler_v2.py</w:t>
+      </w:r>
+      <w:r>
+        <w:t xml:space="preserve">: 2,215 lines.</w:t>
+      </w:r>
+    </w:p>
+    <w:p>
+      <w:pPr>
+        <w:numPr>
+          <w:ilvl w:val="0"/>
+          <w:numId w:val="1050"/>
+        </w:numPr>
+        <w:pStyle w:val="Compact"/>
+      </w:pPr>
+      <w:r>
+        <w:rPr>
+          <w:rStyle w:val="VerbatimChar"/>
+        </w:rPr>
+        <w:t xml:space="preserve">ranking.py</w:t>
+      </w:r>
+      <w:r>
+        <w:t xml:space="preserve">: 486 lines.</w:t>
+      </w:r>
+    </w:p>
+    <w:p>
+      <w:pPr>
+        <w:numPr>
+          <w:ilvl w:val="0"/>
+          <w:numId w:val="1050"/>
+        </w:numPr>
+        <w:pStyle w:val="Compact"/>
+      </w:pPr>
+      <w:r>
+        <w:rPr>
+          <w:rStyle w:val="VerbatimChar"/>
+        </w:rPr>
+        <w:t xml:space="preserve">test_bilingual_pipeline.py</w:t>
+      </w:r>
+      <w:r>
+        <w:t xml:space="preserve">: 1,120 lines.</w:t>
+      </w:r>
+    </w:p>
+    <w:p>
+      <w:pPr>
+        <w:pStyle w:val="Heading3"/>
+      </w:pPr>
+      <w:bookmarkStart w:id="38" w:name="h.-upload-and-routing-integration"/>
+      <w:r>
+        <w:t xml:space="preserve">H. Upload and Routing Integration</w:t>
+      </w:r>
+      <w:bookmarkEnd w:id="38"/>
+    </w:p>
+    <w:p>
+      <w:pPr>
+        <w:pStyle w:val="FirstParagraph"/>
+      </w:pPr>
+      <w:r>
+        <w:rPr>
+          <w:b/>
+        </w:rPr>
+        <w:t xml:space="preserve">When:</w:t>
+      </w:r>
+      <w:r>
+        <w:t xml:space="preserve"> </w:t>
+      </w:r>
+      <w:r>
+        <w:t xml:space="preserve">April to June 2026.</w:t>
+      </w:r>
+      <w:r>
+        <w:t xml:space="preserve"> </w:t>
+      </w:r>
+      <w:r>
+        <w:rPr>
+          <w:b/>
+        </w:rPr>
+        <w:t xml:space="preserve">Technology:</w:t>
+      </w:r>
+      <w:r>
+        <w:t xml:space="preserve"> </w:t>
+      </w:r>
+      <w:r>
+        <w:t xml:space="preserve">Python Supabase client, Postgres upserts, canonical keys, JSON manifests.</w:t>
+      </w:r>
+    </w:p>
+    <w:p>
+      <w:pPr>
+        <w:pStyle w:val="BodyText"/>
+      </w:pPr>
+      <w:r>
+        <w:t xml:space="preserve">What was done:</w:t>
+      </w:r>
+    </w:p>
+    <w:p>
+      <w:pPr>
+        <w:numPr>
+          <w:ilvl w:val="0"/>
+          <w:numId w:val="1051"/>
+        </w:numPr>
+        <w:pStyle w:val="Compact"/>
+      </w:pPr>
+      <w:r>
+        <w:t xml:space="preserve">Register accepted papers in Supabase.</w:t>
+      </w:r>
+    </w:p>
+    <w:p>
+      <w:pPr>
+        <w:numPr>
+          <w:ilvl w:val="0"/>
+          <w:numId w:val="1051"/>
+        </w:numPr>
+        <w:pStyle w:val="Compact"/>
+      </w:pPr>
+      <w:r>
+        <w:t xml:space="preserve">Persist source PDF URLs.</w:t>
+      </w:r>
+    </w:p>
+    <w:p>
+      <w:pPr>
+        <w:numPr>
+          <w:ilvl w:val="0"/>
+          <w:numId w:val="1051"/>
+        </w:numPr>
+        <w:pStyle w:val="Compact"/>
+      </w:pPr>
+      <w:r>
+        <w:t xml:space="preserve">Upsert search-hit audit rows.</w:t>
+      </w:r>
+    </w:p>
+    <w:p>
+      <w:pPr>
+        <w:numPr>
+          <w:ilvl w:val="0"/>
+          <w:numId w:val="1051"/>
+        </w:numPr>
+        <w:pStyle w:val="Compact"/>
+      </w:pPr>
+      <w:r>
+        <w:t xml:space="preserve">Persist query-batch history.</w:t>
+      </w:r>
+    </w:p>
+    <w:p>
+      <w:pPr>
+        <w:numPr>
+          <w:ilvl w:val="0"/>
+          <w:numId w:val="1051"/>
+        </w:numPr>
+        <w:pStyle w:val="Compact"/>
+      </w:pPr>
+      <w:r>
+        <w:t xml:space="preserve">Enqueue active model stage tasks.</w:t>
+      </w:r>
+    </w:p>
+    <w:p>
+      <w:pPr>
+        <w:numPr>
+          <w:ilvl w:val="0"/>
+          <w:numId w:val="1051"/>
+        </w:numPr>
+        <w:pStyle w:val="Compact"/>
+      </w:pPr>
+      <w:r>
+        <w:t xml:space="preserve">Preserve closed AI/human routes when a known paper is re-uploaded.</w:t>
+      </w:r>
+    </w:p>
+    <w:p>
+      <w:pPr>
+        <w:numPr>
+          <w:ilvl w:val="0"/>
+          <w:numId w:val="1051"/>
+        </w:numPr>
+        <w:pStyle w:val="Compact"/>
+      </w:pPr>
+      <w:r>
+        <w:t xml:space="preserve">Recover duplicate-key races by reusing existing paper rows.</w:t>
+      </w:r>
+    </w:p>
+    <w:p>
+      <w:pPr>
+        <w:pStyle w:val="FirstParagraph"/>
+      </w:pPr>
+      <w:r>
+        <w:t xml:space="preserve">Why it was needed:</w:t>
+      </w:r>
+    </w:p>
+    <w:p>
+      <w:pPr>
+        <w:pStyle w:val="BodyText"/>
+      </w:pPr>
+      <w:r>
+        <w:t xml:space="preserve">Crawler discovery and model processing are separate systems. Upload has to bridge them without corrupting already-finalized or human-ready papers. It also needs to preserve search evidence for feedback learning.</w:t>
+      </w:r>
+    </w:p>
+    <w:p>
+      <w:pPr>
+        <w:pStyle w:val="BodyText"/>
+      </w:pPr>
+      <w:r>
+        <w:t xml:space="preserve">How it was implemented:</w:t>
+      </w:r>
+    </w:p>
+    <w:p>
+      <w:pPr>
+        <w:numPr>
+          <w:ilvl w:val="0"/>
+          <w:numId w:val="1052"/>
+        </w:numPr>
+        <w:pStyle w:val="Compact"/>
+      </w:pPr>
+      <w:r>
+        <w:rPr>
+          <w:rStyle w:val="VerbatimChar"/>
+        </w:rPr>
+        <w:t xml:space="preserve">upload_to_supabase.py</w:t>
+      </w:r>
+      <w:r>
+        <w:t xml:space="preserve"> </w:t>
+      </w:r>
+      <w:r>
+        <w:t xml:space="preserve">maps manifest papers to</w:t>
+      </w:r>
+      <w:r>
+        <w:t xml:space="preserve"> </w:t>
+      </w:r>
+      <w:r>
+        <w:rPr>
+          <w:rStyle w:val="VerbatimChar"/>
+        </w:rPr>
+        <w:t xml:space="preserve">papers</w:t>
+      </w:r>
+      <w:r>
+        <w:t xml:space="preserve">.</w:t>
+      </w:r>
+    </w:p>
+    <w:p>
+      <w:pPr>
+        <w:numPr>
+          <w:ilvl w:val="0"/>
+          <w:numId w:val="1052"/>
+        </w:numPr>
+        <w:pStyle w:val="Compact"/>
+      </w:pPr>
+      <w:r>
+        <w:rPr>
+          <w:rStyle w:val="VerbatimChar"/>
+        </w:rPr>
+        <w:t xml:space="preserve">canonical_key</w:t>
+      </w:r>
+      <w:r>
+        <w:t xml:space="preserve"> </w:t>
+      </w:r>
+      <w:r>
+        <w:t xml:space="preserve">deduplicates across providers/DOIs/missing DOI cases.</w:t>
+      </w:r>
+    </w:p>
+    <w:p>
+      <w:pPr>
+        <w:numPr>
+          <w:ilvl w:val="0"/>
+          <w:numId w:val="1052"/>
+        </w:numPr>
+        <w:pStyle w:val="Compact"/>
+      </w:pPr>
+      <w:r>
+        <w:t xml:space="preserve">Search hits use deterministic hit keys.</w:t>
+      </w:r>
+    </w:p>
+    <w:p>
+      <w:pPr>
+        <w:numPr>
+          <w:ilvl w:val="0"/>
+          <w:numId w:val="1052"/>
+        </w:numPr>
+        <w:pStyle w:val="Compact"/>
+      </w:pPr>
+      <w:r>
+        <w:t xml:space="preserve">Existing routed/finalized rows are not reset just because the active stage changed.</w:t>
+      </w:r>
+    </w:p>
+    <w:p>
+      <w:pPr>
+        <w:pStyle w:val="FirstParagraph"/>
+      </w:pPr>
+      <w:r>
+        <w:t xml:space="preserve">Evidence:</w:t>
+      </w:r>
+    </w:p>
+    <w:p>
+      <w:pPr>
+        <w:numPr>
+          <w:ilvl w:val="0"/>
+          <w:numId w:val="1053"/>
+        </w:numPr>
+        <w:pStyle w:val="Compact"/>
+      </w:pPr>
+      <w:r>
+        <w:t xml:space="preserve">README upload script section.</w:t>
+      </w:r>
+    </w:p>
+    <w:p>
+      <w:pPr>
+        <w:numPr>
+          <w:ilvl w:val="0"/>
+          <w:numId w:val="1053"/>
+        </w:numPr>
+        <w:pStyle w:val="Compact"/>
+      </w:pPr>
+      <w:r>
+        <w:rPr>
+          <w:rStyle w:val="VerbatimChar"/>
+        </w:rPr>
+        <w:t xml:space="preserve">upload_to_supabase.py</w:t>
+      </w:r>
+      <w:r>
+        <w:t xml:space="preserve">.</w:t>
+      </w:r>
+    </w:p>
+    <w:p>
+      <w:pPr>
+        <w:numPr>
+          <w:ilvl w:val="0"/>
+          <w:numId w:val="1053"/>
+        </w:numPr>
+        <w:pStyle w:val="Compact"/>
+      </w:pPr>
+      <w:r>
+        <w:rPr>
+          <w:rStyle w:val="VerbatimChar"/>
+        </w:rPr>
+        <w:t xml:space="preserve">paper_search_hits</w:t>
+      </w:r>
+      <w:r>
+        <w:t xml:space="preserve">,</w:t>
+      </w:r>
+      <w:r>
+        <w:t xml:space="preserve"> </w:t>
+      </w:r>
+      <w:r>
+        <w:rPr>
+          <w:rStyle w:val="VerbatimChar"/>
+        </w:rPr>
+        <w:t xml:space="preserve">paper_search_batches</w:t>
+      </w:r>
+      <w:r>
+        <w:t xml:space="preserve">,</w:t>
+      </w:r>
+      <w:r>
+        <w:t xml:space="preserve"> </w:t>
+      </w:r>
+      <w:r>
+        <w:rPr>
+          <w:rStyle w:val="VerbatimChar"/>
+        </w:rPr>
+        <w:t xml:space="preserve">paper_search_batch_hits</w:t>
+      </w:r>
+      <w:r>
+        <w:t xml:space="preserve">.</w:t>
+      </w:r>
+    </w:p>
+    <w:p>
+      <w:pPr>
+        <w:pStyle w:val="Heading3"/>
+      </w:pPr>
+      <w:bookmarkStart w:id="39" w:name="i.-pipeline-cockpit"/>
+      <w:r>
+        <w:t xml:space="preserve">I. Pipeline Cockpit</w:t>
+      </w:r>
+      <w:bookmarkEnd w:id="39"/>
+    </w:p>
+    <w:p>
+      <w:pPr>
+        <w:pStyle w:val="FirstParagraph"/>
+      </w:pPr>
+      <w:r>
+        <w:rPr>
+          <w:b/>
+        </w:rPr>
+        <w:t xml:space="preserve">When:</w:t>
+      </w:r>
+      <w:r>
+        <w:t xml:space="preserve"> </w:t>
+      </w:r>
+      <w:r>
+        <w:t xml:space="preserve">2026-05-13 and refined 2026-05-29.</w:t>
+      </w:r>
+      <w:r>
+        <w:t xml:space="preserve"> </w:t>
+      </w:r>
+      <w:r>
+        <w:rPr>
+          <w:b/>
+        </w:rPr>
+        <w:t xml:space="preserve">Technology:</w:t>
+      </w:r>
+      <w:r>
+        <w:t xml:space="preserve"> </w:t>
+      </w:r>
+      <w:r>
+        <w:t xml:space="preserve">Postgres aggregate RPC, React view, role-stable model labels.</w:t>
+      </w:r>
+    </w:p>
+    <w:p>
+      <w:pPr>
+        <w:pStyle w:val="BodyText"/>
+      </w:pPr>
+      <w:r>
+        <w:t xml:space="preserve">What was done:</w:t>
+      </w:r>
+    </w:p>
+    <w:p>
+      <w:pPr>
+        <w:numPr>
+          <w:ilvl w:val="0"/>
+          <w:numId w:val="1054"/>
+        </w:numPr>
+        <w:pStyle w:val="Compact"/>
+      </w:pPr>
+      <w:r>
+        <w:t xml:space="preserve">Added a Pipeline cockpit dashboard.</w:t>
+      </w:r>
+    </w:p>
+    <w:p>
+      <w:pPr>
+        <w:numPr>
+          <w:ilvl w:val="0"/>
+          <w:numId w:val="1054"/>
+        </w:numPr>
+        <w:pStyle w:val="Compact"/>
+      </w:pPr>
+      <w:r>
+        <w:t xml:space="preserve">Showed crawler-to-human funnel.</w:t>
+      </w:r>
+    </w:p>
+    <w:p>
+      <w:pPr>
+        <w:numPr>
+          <w:ilvl w:val="0"/>
+          <w:numId w:val="1054"/>
+        </w:numPr>
+        <w:pStyle w:val="Compact"/>
+      </w:pPr>
+      <w:r>
+        <w:t xml:space="preserve">Showed current stage queues/errors.</w:t>
+      </w:r>
+    </w:p>
+    <w:p>
+      <w:pPr>
+        <w:numPr>
+          <w:ilvl w:val="0"/>
+          <w:numId w:val="1054"/>
+        </w:numPr>
+        <w:pStyle w:val="Compact"/>
+      </w:pPr>
+      <w:r>
+        <w:t xml:space="preserve">Added time filters.</w:t>
+      </w:r>
+    </w:p>
+    <w:p>
+      <w:pPr>
+        <w:numPr>
+          <w:ilvl w:val="0"/>
+          <w:numId w:val="1054"/>
+        </w:numPr>
+        <w:pStyle w:val="Compact"/>
+      </w:pPr>
+      <w:r>
+        <w:t xml:space="preserve">Added stable role labels: Small model, Medium model, Strong model.</w:t>
+      </w:r>
+    </w:p>
+    <w:p>
+      <w:pPr>
+        <w:numPr>
+          <w:ilvl w:val="0"/>
+          <w:numId w:val="1054"/>
+        </w:numPr>
+        <w:pStyle w:val="Compact"/>
+      </w:pPr>
+      <w:r>
+        <w:t xml:space="preserve">Backfilled historical direct Small -&gt; Strong data into Medium counters for display.</w:t>
+      </w:r>
+    </w:p>
+    <w:p>
+      <w:pPr>
+        <w:pStyle w:val="FirstParagraph"/>
+      </w:pPr>
+      <w:r>
+        <w:t xml:space="preserve">Why it was needed:</w:t>
+      </w:r>
+    </w:p>
+    <w:p>
+      <w:pPr>
+        <w:pStyle w:val="BodyText"/>
+      </w:pPr>
+      <w:r>
+        <w:t xml:space="preserve">Daily ops is complex. The team needed a cockpit view that answered</w:t>
+      </w:r>
+      <w:r>
+        <w:t xml:space="preserve"> </w:t>
+      </w:r>
+      <w:r>
+        <w:t xml:space="preserve">“</w:t>
+      </w:r>
+      <w:r>
+        <w:t xml:space="preserve">where are papers stuck right now?</w:t>
+      </w:r>
+      <w:r>
+        <w:t xml:space="preserve">”</w:t>
+      </w:r>
+      <w:r>
+        <w:t xml:space="preserve"> </w:t>
+      </w:r>
+      <w:r>
+        <w:t xml:space="preserve">without requiring direct database inspection.</w:t>
+      </w:r>
+    </w:p>
+    <w:p>
+      <w:pPr>
+        <w:pStyle w:val="BodyText"/>
+      </w:pPr>
+      <w:r>
+        <w:t xml:space="preserve">How it was implemented:</w:t>
+      </w:r>
+    </w:p>
+    <w:p>
+      <w:pPr>
+        <w:numPr>
+          <w:ilvl w:val="0"/>
+          <w:numId w:val="1055"/>
+        </w:numPr>
+        <w:pStyle w:val="Compact"/>
+      </w:pPr>
+      <w:r>
+        <w:rPr>
+          <w:rStyle w:val="VerbatimChar"/>
+        </w:rPr>
+        <w:t xml:space="preserve">get_pipeline_ops_snapshot</w:t>
+      </w:r>
+      <w:r>
+        <w:t xml:space="preserve"> </w:t>
+      </w:r>
+      <w:r>
+        <w:t xml:space="preserve">aggregates search batches, stage tasks, AI extraction outcomes, submissions, approvals, and review outcomes.</w:t>
+      </w:r>
+    </w:p>
+    <w:p>
+      <w:pPr>
+        <w:numPr>
+          <w:ilvl w:val="0"/>
+          <w:numId w:val="1055"/>
+        </w:numPr>
+        <w:pStyle w:val="Compact"/>
+      </w:pPr>
+      <w:r>
+        <w:t xml:space="preserve">Frontend</w:t>
+      </w:r>
+      <w:r>
+        <w:t xml:space="preserve"> </w:t>
+      </w:r>
+      <w:r>
+        <w:rPr>
+          <w:rStyle w:val="VerbatimChar"/>
+        </w:rPr>
+        <w:t xml:space="preserve">PipelineOpsView</w:t>
+      </w:r>
+      <w:r>
+        <w:t xml:space="preserve"> </w:t>
+      </w:r>
+      <w:r>
+        <w:t xml:space="preserve">renders funnel bars and current queues.</w:t>
+      </w:r>
+    </w:p>
+    <w:p>
+      <w:pPr>
+        <w:numPr>
+          <w:ilvl w:val="0"/>
+          <w:numId w:val="1055"/>
+        </w:numPr>
+        <w:pStyle w:val="Compact"/>
+      </w:pPr>
+      <w:r>
+        <w:rPr>
+          <w:rStyle w:val="VerbatimChar"/>
+        </w:rPr>
+        <w:t xml:space="preserve">annotateHelpers.js</w:t>
+      </w:r>
+      <w:r>
+        <w:t xml:space="preserve"> </w:t>
+      </w:r>
+      <w:r>
+        <w:t xml:space="preserve">maps model specs into stable role labels.</w:t>
+      </w:r>
+    </w:p>
+    <w:p>
+      <w:pPr>
+        <w:pStyle w:val="FirstParagraph"/>
+      </w:pPr>
+      <w:r>
+        <w:t xml:space="preserve">Evidence:</w:t>
+      </w:r>
+    </w:p>
+    <w:p>
+      <w:pPr>
+        <w:numPr>
+          <w:ilvl w:val="0"/>
+          <w:numId w:val="1056"/>
+        </w:numPr>
+        <w:pStyle w:val="Compact"/>
+      </w:pPr>
+      <w:r>
+        <w:rPr>
+          <w:rStyle w:val="VerbatimChar"/>
+        </w:rPr>
+        <w:t xml:space="preserve">get_pipeline_ops_snapshot</w:t>
+      </w:r>
+      <w:r>
+        <w:t xml:space="preserve"> </w:t>
+      </w:r>
+      <w:r>
+        <w:t xml:space="preserve">in</w:t>
+      </w:r>
+      <w:r>
+        <w:t xml:space="preserve"> </w:t>
+      </w:r>
+      <w:r>
+        <w:rPr>
+          <w:rStyle w:val="VerbatimChar"/>
+        </w:rPr>
+        <w:t xml:space="preserve">migration.sql</w:t>
+      </w:r>
+      <w:r>
+        <w:t xml:space="preserve">.</w:t>
+      </w:r>
+    </w:p>
+    <w:p>
+      <w:pPr>
+        <w:numPr>
+          <w:ilvl w:val="0"/>
+          <w:numId w:val="1056"/>
+        </w:numPr>
+        <w:pStyle w:val="Compact"/>
+      </w:pPr>
+      <w:r>
+        <w:rPr>
+          <w:rStyle w:val="VerbatimChar"/>
+        </w:rPr>
+        <w:t xml:space="preserve">PipelineOpsView.jsx</w:t>
+      </w:r>
+      <w:r>
+        <w:t xml:space="preserve">.</w:t>
+      </w:r>
+    </w:p>
+    <w:p>
+      <w:pPr>
+        <w:numPr>
+          <w:ilvl w:val="0"/>
+          <w:numId w:val="1056"/>
+        </w:numPr>
+        <w:pStyle w:val="Compact"/>
+      </w:pPr>
+      <w:r>
+        <w:rPr>
+          <w:rStyle w:val="VerbatimChar"/>
+        </w:rPr>
+        <w:t xml:space="preserve">annotateHelpers.js</w:t>
+      </w:r>
+      <w:r>
+        <w:t xml:space="preserve">.</w:t>
+      </w:r>
+    </w:p>
+    <w:p>
+      <w:pPr>
+        <w:pStyle w:val="Heading3"/>
+      </w:pPr>
+      <w:bookmarkStart w:id="40" w:name="X5f2c96f0eb85badba713a830d3406578cbee01b"/>
+      <w:r>
+        <w:t xml:space="preserve">J. Documentation, Agent Rules, and Live Ops State</w:t>
+      </w:r>
+      <w:bookmarkEnd w:id="40"/>
+    </w:p>
+    <w:p>
+      <w:pPr>
+        <w:pStyle w:val="FirstParagraph"/>
+      </w:pPr>
+      <w:r>
+        <w:rPr>
+          <w:b/>
+        </w:rPr>
+        <w:t xml:space="preserve">When:</w:t>
+      </w:r>
+      <w:r>
+        <w:t xml:space="preserve"> </w:t>
+      </w:r>
+      <w:r>
+        <w:t xml:space="preserve">March to June 2026.</w:t>
+      </w:r>
+      <w:r>
+        <w:t xml:space="preserve"> </w:t>
+      </w:r>
+      <w:r>
+        <w:rPr>
+          <w:b/>
+        </w:rPr>
+        <w:t xml:space="preserve">Technology:</w:t>
+      </w:r>
+      <w:r>
+        <w:t xml:space="preserve"> </w:t>
+      </w:r>
+      <w:r>
+        <w:t xml:space="preserve">Markdown, DOCX/PDF export scripts, repo instructions.</w:t>
+      </w:r>
+    </w:p>
+    <w:p>
+      <w:pPr>
+        <w:pStyle w:val="BodyText"/>
+      </w:pPr>
+      <w:r>
+        <w:t xml:space="preserve">What was done:</w:t>
+      </w:r>
+    </w:p>
+    <w:p>
+      <w:pPr>
+        <w:numPr>
+          <w:ilvl w:val="0"/>
+          <w:numId w:val="1057"/>
+        </w:numPr>
+        <w:pStyle w:val="Compact"/>
+      </w:pPr>
+      <w:r>
+        <w:t xml:space="preserve">README updated repeatedly as architecture changed.</w:t>
+      </w:r>
+    </w:p>
+    <w:p>
+      <w:pPr>
+        <w:numPr>
+          <w:ilvl w:val="0"/>
+          <w:numId w:val="1057"/>
+        </w:numPr>
+        <w:pStyle w:val="Compact"/>
+      </w:pPr>
+      <w:r>
+        <w:t xml:space="preserve">BACKLOG maintained and completed items removed.</w:t>
+      </w:r>
+    </w:p>
+    <w:p>
+      <w:pPr>
+        <w:numPr>
+          <w:ilvl w:val="0"/>
+          <w:numId w:val="1057"/>
+        </w:numPr>
+        <w:pStyle w:val="Compact"/>
+      </w:pPr>
+      <w:r>
+        <w:t xml:space="preserve">AGENTS and INSTRUCTIONS written/updated.</w:t>
+      </w:r>
+    </w:p>
+    <w:p>
+      <w:pPr>
+        <w:numPr>
+          <w:ilvl w:val="0"/>
+          <w:numId w:val="1057"/>
+        </w:numPr>
+        <w:pStyle w:val="Compact"/>
+      </w:pPr>
+      <w:r>
+        <w:t xml:space="preserve">Reviewer SOP and workflow map created.</w:t>
+      </w:r>
+    </w:p>
+    <w:p>
+      <w:pPr>
+        <w:numPr>
+          <w:ilvl w:val="0"/>
+          <w:numId w:val="1057"/>
+        </w:numPr>
+        <w:pStyle w:val="Compact"/>
+      </w:pPr>
+      <w:r>
+        <w:t xml:space="preserve">Handoff state document maintained.</w:t>
+      </w:r>
+    </w:p>
+    <w:p>
+      <w:pPr>
+        <w:numPr>
+          <w:ilvl w:val="0"/>
+          <w:numId w:val="1057"/>
+        </w:numPr>
+        <w:pStyle w:val="Compact"/>
+      </w:pPr>
+      <w:r>
+        <w:t xml:space="preserve">Defense reports/decks generated.</w:t>
+      </w:r>
+    </w:p>
+    <w:p>
+      <w:pPr>
+        <w:numPr>
+          <w:ilvl w:val="0"/>
+          <w:numId w:val="1057"/>
+        </w:numPr>
+        <w:pStyle w:val="Compact"/>
+      </w:pPr>
+      <w:r>
+        <w:t xml:space="preserve">Runtime secret handling documented.</w:t>
+      </w:r>
+    </w:p>
+    <w:p>
+      <w:pPr>
+        <w:pStyle w:val="FirstParagraph"/>
+      </w:pPr>
+      <w:r>
+        <w:t xml:space="preserve">Why it was needed:</w:t>
+      </w:r>
+    </w:p>
+    <w:p>
+      <w:pPr>
+        <w:pStyle w:val="BodyText"/>
+      </w:pPr>
+      <w:r>
+        <w:t xml:space="preserve">This project is large enough that undocumented decisions get accidentally undone. Documentation captures why Gemma is text-mode, why no hard-negative crawler vetoes are allowed, why source-URL PDFs are default, why cockpit AI lists must stay slim, and why final truth comes from approval outcomes.</w:t>
+      </w:r>
+    </w:p>
+    <w:p>
+      <w:pPr>
+        <w:pStyle w:val="BodyText"/>
+      </w:pPr>
+      <w:r>
+        <w:t xml:space="preserve">Assessment value:</w:t>
+      </w:r>
+    </w:p>
+    <w:p>
+      <w:pPr>
+        <w:pStyle w:val="BodyText"/>
+      </w:pPr>
+      <w:r>
+        <w:t xml:space="preserve">Documentation here is operational infrastructure. It keeps future agents and team members from breaking production assumptions.</w:t>
+      </w:r>
+    </w:p>
+    <w:p>
+      <w:pPr>
+        <w:pStyle w:val="Heading2"/>
+      </w:pPr>
+      <w:bookmarkStart w:id="41" w:name="arciel-evidence-summary-by-area"/>
+      <w:r>
+        <w:t xml:space="preserve">Arciel Evidence Summary by Area</w:t>
+      </w:r>
+      <w:bookmarkEnd w:id="41"/>
+    </w:p>
+    <w:tbl>
+      <w:tblPr>
+        <w:tblStyle w:val="Table"/>
+        <w:tblW w:type="pct" w:w="5000.0"/>
+        <w:tblLook w:firstRow="1"/>
+      </w:tblPr>
+      <w:tblGrid>
+        <w:gridCol w:w="2640"/>
+        <w:gridCol w:w="2640"/>
+        <w:gridCol w:w="2640"/>
+      </w:tblGrid>
+      <w:tr>
+        <w:trPr>
+          <w:cnfStyle w:firstRow="1"/>
+        </w:trPr>
+        <w:tc>
+          <w:tcPr>
+            <w:tcBorders>
+              <w:bottom w:val="single"/>
+            </w:tcBorders>
+            <w:vAlign w:val="bottom"/>
+          </w:tcPr>
+          <w:p>
+            <w:pPr>
+              <w:pStyle w:val="Compact"/>
+              <w:jc w:val="left"/>
+            </w:pPr>
+            <w:r>
+              <w:t xml:space="preserve">Area</w:t>
+            </w:r>
+          </w:p>
+        </w:tc>
+        <w:tc>
+          <w:tcPr>
+            <w:tcBorders>
+              <w:bottom w:val="single"/>
+            </w:tcBorders>
+            <w:vAlign w:val="bottom"/>
+          </w:tcPr>
+          <w:p>
+            <w:pPr>
+              <w:pStyle w:val="Compact"/>
+              <w:jc w:val="left"/>
+            </w:pPr>
+            <w:r>
+              <w:t xml:space="preserve">Main files</w:t>
+            </w:r>
+          </w:p>
+        </w:tc>
+        <w:tc>
+          <w:tcPr>
+            <w:tcBorders>
+              <w:bottom w:val="single"/>
+            </w:tcBorders>
+            <w:vAlign w:val="bottom"/>
+          </w:tcPr>
+          <w:p>
+            <w:pPr>
+              <w:pStyle w:val="Compact"/>
+              <w:jc w:val="left"/>
+            </w:pPr>
+            <w:r>
+              <w:t xml:space="preserve">Evidence</w:t>
+            </w:r>
+          </w:p>
+        </w:tc>
+      </w:tr>
+      <w:tr>
+        <w:tc>
+          <w:p>
+            <w:pPr>
+              <w:pStyle w:val="Compact"/>
+              <w:jc w:val="left"/>
+            </w:pPr>
+            <w:r>
+              <w:t xml:space="preserve">Schema/RLS/RPC</w:t>
+            </w:r>
+          </w:p>
+        </w:tc>
+        <w:tc>
+          <w:p>
+            <w:pPr>
+              <w:pStyle w:val="Compact"/>
+              <w:jc w:val="left"/>
+            </w:pPr>
+            <w:r>
+              <w:rPr>
+                <w:rStyle w:val="VerbatimChar"/>
+              </w:rPr>
+              <w:t xml:space="preserve">migration.sql</w:t>
+            </w:r>
+          </w:p>
+        </w:tc>
+        <w:tc>
+          <w:p>
+            <w:pPr>
+              <w:pStyle w:val="Compact"/>
+              <w:jc w:val="left"/>
+            </w:pPr>
+            <w:r>
+              <w:t xml:space="preserve">5,396 lines, 31 tables, 75 policies.</w:t>
+            </w:r>
+          </w:p>
+        </w:tc>
+      </w:tr>
+      <w:tr>
+        <w:tc>
+          <w:p>
+            <w:pPr>
+              <w:pStyle w:val="Compact"/>
+              <w:jc w:val="left"/>
+            </w:pPr>
+            <w:r>
+              <w:t xml:space="preserve">AI cascade</w:t>
+            </w:r>
+          </w:p>
+        </w:tc>
+        <w:tc>
+          <w:p>
+            <w:pPr>
+              <w:pStyle w:val="Compact"/>
+              <w:jc w:val="left"/>
+            </w:pPr>
+            <w:r>
+              <w:rPr>
+                <w:rStyle w:val="VerbatimChar"/>
+              </w:rPr>
+              <w:t xml:space="preserve">unified_evaluator.py</w:t>
+            </w:r>
+            <w:r>
+              <w:t xml:space="preserve">,</w:t>
+            </w:r>
+            <w:r>
+              <w:t xml:space="preserve"> </w:t>
+            </w:r>
+            <w:r>
+              <w:rPr>
+                <w:rStyle w:val="VerbatimChar"/>
+              </w:rPr>
+              <w:t xml:space="preserve">ai_routing.py</w:t>
+            </w:r>
+            <w:r>
+              <w:t xml:space="preserve">,</w:t>
+            </w:r>
+            <w:r>
+              <w:t xml:space="preserve"> </w:t>
+            </w:r>
+            <w:r>
+              <w:rPr>
+                <w:rStyle w:val="VerbatimChar"/>
+              </w:rPr>
+              <w:t xml:space="preserve">process_stage_queue.py</w:t>
+            </w:r>
+          </w:p>
+        </w:tc>
+        <w:tc>
+          <w:p>
+            <w:pPr>
+              <w:pStyle w:val="Compact"/>
+              <w:jc w:val="left"/>
+            </w:pPr>
+            <w:r>
+              <w:t xml:space="preserve">3,089 core lines plus tests.</w:t>
+            </w:r>
+          </w:p>
+        </w:tc>
+      </w:tr>
+      <w:tr>
+        <w:tc>
+          <w:p>
+            <w:pPr>
+              <w:pStyle w:val="Compact"/>
+              <w:jc w:val="left"/>
+            </w:pPr>
+            <w:r>
+              <w:t xml:space="preserve">Crawler</w:t>
+            </w:r>
+          </w:p>
+        </w:tc>
+        <w:tc>
+          <w:p>
+            <w:pPr>
+              <w:pStyle w:val="Compact"/>
+              <w:jc w:val="left"/>
+            </w:pPr>
+            <w:r>
+              <w:rPr>
+                <w:rStyle w:val="VerbatimChar"/>
+              </w:rPr>
+              <w:t xml:space="preserve">crawler_v2.py</w:t>
+            </w:r>
+            <w:r>
+              <w:t xml:space="preserve">,</w:t>
+            </w:r>
+            <w:r>
+              <w:t xml:space="preserve"> </w:t>
+            </w:r>
+            <w:r>
+              <w:rPr>
+                <w:rStyle w:val="VerbatimChar"/>
+              </w:rPr>
+              <w:t xml:space="preserve">ranking.py</w:t>
+            </w:r>
+            <w:r>
+              <w:t xml:space="preserve">, source adapters</w:t>
+            </w:r>
+          </w:p>
+        </w:tc>
+        <w:tc>
+          <w:p>
+            <w:pPr>
+              <w:pStyle w:val="Compact"/>
+              <w:jc w:val="left"/>
+            </w:pPr>
+            <w:r>
+              <w:t xml:space="preserve">2,701 core crawler/ranking lines.</w:t>
+            </w:r>
+          </w:p>
+        </w:tc>
+      </w:tr>
+      <w:tr>
+        <w:tc>
+          <w:p>
+            <w:pPr>
+              <w:pStyle w:val="Compact"/>
+              <w:jc w:val="left"/>
+            </w:pPr>
+            <w:r>
+              <w:t xml:space="preserve">Feedback</w:t>
+            </w:r>
+          </w:p>
+        </w:tc>
+        <w:tc>
+          <w:p>
+            <w:pPr>
+              <w:pStyle w:val="Compact"/>
+              <w:jc w:val="left"/>
+            </w:pPr>
+            <w:r>
+              <w:rPr>
+                <w:rStyle w:val="VerbatimChar"/>
+              </w:rPr>
+              <w:t xml:space="preserve">update_terms.py</w:t>
+            </w:r>
+            <w:r>
+              <w:t xml:space="preserve">, feedback modules</w:t>
+            </w:r>
+          </w:p>
+        </w:tc>
+        <w:tc>
+          <w:p>
+            <w:pPr>
+              <w:pStyle w:val="Compact"/>
+              <w:jc w:val="left"/>
+            </w:pPr>
+            <w:r>
+              <w:t xml:space="preserve">1,219 main feedback lines.</w:t>
+            </w:r>
+          </w:p>
+        </w:tc>
+      </w:tr>
+      <w:tr>
+        <w:tc>
+          <w:p>
+            <w:pPr>
+              <w:pStyle w:val="Compact"/>
+              <w:jc w:val="left"/>
+            </w:pPr>
+            <w:r>
+              <w:t xml:space="preserve">Daily ops</w:t>
+            </w:r>
+          </w:p>
+        </w:tc>
+        <w:tc>
+          <w:p>
+            <w:pPr>
+              <w:pStyle w:val="Compact"/>
+              <w:jc w:val="left"/>
+            </w:pPr>
+            <w:r>
+              <w:rPr>
+                <w:rStyle w:val="VerbatimChar"/>
+              </w:rPr>
+              <w:t xml:space="preserve">daily_ops_orchestrator.py</w:t>
+            </w:r>
+            <w:r>
+              <w:t xml:space="preserve">, workflow YAML, tests</w:t>
+            </w:r>
+          </w:p>
+        </w:tc>
+        <w:tc>
+          <w:p>
+            <w:pPr>
+              <w:pStyle w:val="Compact"/>
+              <w:jc w:val="left"/>
+            </w:pPr>
+            <w:r>
+              <w:t xml:space="preserve">GitHub Actions every 5 minutes, 5 workers.</w:t>
+            </w:r>
+          </w:p>
+        </w:tc>
+      </w:tr>
+      <w:tr>
+        <w:tc>
+          <w:p>
+            <w:pPr>
+              <w:pStyle w:val="Compact"/>
+              <w:jc w:val="left"/>
+            </w:pPr>
+            <w:r>
+              <w:t xml:space="preserve">Upload/storage</w:t>
+            </w:r>
+          </w:p>
+        </w:tc>
+        <w:tc>
+          <w:p>
+            <w:pPr>
+              <w:pStyle w:val="Compact"/>
+              <w:jc w:val="left"/>
+            </w:pPr>
+            <w:r>
+              <w:rPr>
+                <w:rStyle w:val="VerbatimChar"/>
+              </w:rPr>
+              <w:t xml:space="preserve">upload_to_supabase.py</w:t>
+            </w:r>
+            <w:r>
+              <w:t xml:space="preserve">,</w:t>
+            </w:r>
+            <w:r>
+              <w:t xml:space="preserve"> </w:t>
+            </w:r>
+            <w:r>
+              <w:rPr>
+                <w:rStyle w:val="VerbatimChar"/>
+              </w:rPr>
+              <w:t xml:space="preserve">api/pdf.js</w:t>
+            </w:r>
+            <w:r>
+              <w:t xml:space="preserve">,</w:t>
+            </w:r>
+            <w:r>
+              <w:t xml:space="preserve"> </w:t>
+            </w:r>
+            <w:r>
+              <w:rPr>
+                <w:rStyle w:val="VerbatimChar"/>
+              </w:rPr>
+              <w:t xml:space="preserve">pdfCache.js</w:t>
+            </w:r>
+          </w:p>
+        </w:tc>
+        <w:tc>
+          <w:p>
+            <w:pPr>
+              <w:pStyle w:val="Compact"/>
+              <w:jc w:val="left"/>
+            </w:pPr>
+            <w:r>
+              <w:t xml:space="preserve">Source-URL PDF architecture and egress control.</w:t>
+            </w:r>
+          </w:p>
+        </w:tc>
+      </w:tr>
+      <w:tr>
+        <w:tc>
+          <w:p>
+            <w:pPr>
+              <w:pStyle w:val="Compact"/>
+              <w:jc w:val="left"/>
+            </w:pPr>
+            <w:r>
+              <w:t xml:space="preserve">Tests</w:t>
+            </w:r>
+          </w:p>
+        </w:tc>
+        <w:tc>
+          <w:p>
+            <w:pPr>
+              <w:pStyle w:val="Compact"/>
+              <w:jc w:val="left"/>
+            </w:pPr>
+            <w:r>
+              <w:rPr>
+                <w:rStyle w:val="VerbatimChar"/>
+              </w:rPr>
+              <w:t xml:space="preserve">test_ai_routing.py</w:t>
+            </w:r>
+            <w:r>
+              <w:t xml:space="preserve">,</w:t>
+            </w:r>
+            <w:r>
+              <w:t xml:space="preserve"> </w:t>
+            </w:r>
+            <w:r>
+              <w:rPr>
+                <w:rStyle w:val="VerbatimChar"/>
+              </w:rPr>
+              <w:t xml:space="preserve">test_daily_ops.py</w:t>
+            </w:r>
+            <w:r>
+              <w:t xml:space="preserve">,</w:t>
+            </w:r>
+            <w:r>
+              <w:t xml:space="preserve"> </w:t>
+            </w:r>
+            <w:r>
+              <w:rPr>
+                <w:rStyle w:val="VerbatimChar"/>
+              </w:rPr>
+              <w:t xml:space="preserve">test_bilingual_pipeline.py</w:t>
+            </w:r>
+            <w:r>
+              <w:t xml:space="preserve">, frontend scanner tests</w:t>
+            </w:r>
+          </w:p>
+        </w:tc>
+        <w:tc>
+          <w:p>
+            <w:pPr>
+              <w:pStyle w:val="Compact"/>
+              <w:jc w:val="left"/>
+            </w:pPr>
+            <w:r>
+              <w:t xml:space="preserve">5,617 tracked test lines.</w:t>
+            </w:r>
+          </w:p>
+        </w:tc>
+      </w:tr>
+      <w:tr>
+        <w:tc>
+          <w:p>
+            <w:pPr>
+              <w:pStyle w:val="Compact"/>
+              <w:jc w:val="left"/>
+            </w:pPr>
+            <w:r>
+              <w:t xml:space="preserve">Docs/project management</w:t>
+            </w:r>
+          </w:p>
+        </w:tc>
+        <w:tc>
+          <w:p>
+            <w:pPr>
+              <w:pStyle w:val="Compact"/>
+              <w:jc w:val="left"/>
+            </w:pPr>
+            <w:r>
+              <w:t xml:space="preserve">README, AGENTS, STATE, workflow map, defense reports</w:t>
+            </w:r>
+          </w:p>
+        </w:tc>
+        <w:tc>
+          <w:p>
+            <w:pPr>
+              <w:pStyle w:val="Compact"/>
+              <w:jc w:val="left"/>
+            </w:pPr>
+            <w:r>
+              <w:t xml:space="preserve">Standing instructions and operational handoff.</w:t>
+            </w:r>
+          </w:p>
+        </w:tc>
+      </w:tr>
+    </w:tbl>
     <w:sectPr/>
   </w:body>
 </w:document>
@@ -3734,6 +7409,118 @@
     <w:lvl w:ilvl="8">
       <w:numFmt w:val="bullet"/>
       <w:lvlText w:val="•"/>
+      <w:lvlJc w:val="left"/>
+      <w:pPr>
+        <w:tabs>
+          <w:tab w:val="num" w:pos="5760"/>
+        </w:tabs>
+        <w:ind w:left="6240" w:hanging="480"/>
+      </w:pPr>
+    </w:lvl>
+  </w:abstractNum>
+  <w:abstractNum w:abstractNumId="99411">
+    <w:nsid w:val="71315dca"/>
+    <w:multiLevelType w:val="multilevel"/>
+    <w:lvl w:ilvl="0">
+      <w:start w:val="1"/>
+      <w:numFmt w:val="decimal"/>
+      <w:lvlText w:val="%1."/>
+      <w:lvlJc w:val="left"/>
+      <w:pPr>
+        <w:tabs>
+          <w:tab w:val="num" w:pos="0"/>
+        </w:tabs>
+        <w:ind w:left="480" w:hanging="480"/>
+      </w:pPr>
+    </w:lvl>
+    <w:lvl w:ilvl="1">
+      <w:start w:val="1"/>
+      <w:numFmt w:val="decimal"/>
+      <w:lvlText w:val="%2."/>
+      <w:lvlJc w:val="left"/>
+      <w:pPr>
+        <w:tabs>
+          <w:tab w:val="num" w:pos="720"/>
+        </w:tabs>
+        <w:ind w:left="1200" w:hanging="480"/>
+      </w:pPr>
+    </w:lvl>
+    <w:lvl w:ilvl="2">
+      <w:start w:val="1"/>
+      <w:numFmt w:val="decimal"/>
+      <w:lvlText w:val="%3."/>
+      <w:lvlJc w:val="left"/>
+      <w:pPr>
+        <w:tabs>
+          <w:tab w:val="num" w:pos="1440"/>
+        </w:tabs>
+        <w:ind w:left="1920" w:hanging="480"/>
+      </w:pPr>
+    </w:lvl>
+    <w:lvl w:ilvl="3">
+      <w:start w:val="1"/>
+      <w:numFmt w:val="decimal"/>
+      <w:lvlText w:val="%4."/>
+      <w:lvlJc w:val="left"/>
+      <w:pPr>
+        <w:tabs>
+          <w:tab w:val="num" w:pos="2160"/>
+        </w:tabs>
+        <w:ind w:left="2640" w:hanging="480"/>
+      </w:pPr>
+    </w:lvl>
+    <w:lvl w:ilvl="4">
+      <w:start w:val="1"/>
+      <w:numFmt w:val="decimal"/>
+      <w:lvlText w:val="%5."/>
+      <w:lvlJc w:val="left"/>
+      <w:pPr>
+        <w:tabs>
+          <w:tab w:val="num" w:pos="2880"/>
+        </w:tabs>
+        <w:ind w:left="3360" w:hanging="480"/>
+      </w:pPr>
+    </w:lvl>
+    <w:lvl w:ilvl="5">
+      <w:start w:val="1"/>
+      <w:numFmt w:val="decimal"/>
+      <w:lvlText w:val="%6."/>
+      <w:lvlJc w:val="left"/>
+      <w:pPr>
+        <w:tabs>
+          <w:tab w:val="num" w:pos="3600"/>
+        </w:tabs>
+        <w:ind w:left="4080" w:hanging="480"/>
+      </w:pPr>
+    </w:lvl>
+    <w:lvl w:ilvl="6">
+      <w:start w:val="1"/>
+      <w:numFmt w:val="decimal"/>
+      <w:lvlText w:val="%7."/>
+      <w:lvlJc w:val="left"/>
+      <w:pPr>
+        <w:tabs>
+          <w:tab w:val="num" w:pos="4320"/>
+        </w:tabs>
+        <w:ind w:left="4800" w:hanging="480"/>
+      </w:pPr>
+    </w:lvl>
+    <w:lvl w:ilvl="7">
+      <w:start w:val="1"/>
+      <w:numFmt w:val="decimal"/>
+      <w:lvlText w:val="%8."/>
+      <w:lvlJc w:val="left"/>
+      <w:pPr>
+        <w:tabs>
+          <w:tab w:val="num" w:pos="5040"/>
+        </w:tabs>
+        <w:ind w:left="5520" w:hanging="480"/>
+      </w:pPr>
+    </w:lvl>
+    <w:lvl w:ilvl="8">
+      <w:start w:val="1"/>
+      <w:numFmt w:val="decimal"/>
+      <w:lvlText w:val="%9."/>
       <w:lvlJc w:val="left"/>
       <w:pPr>
         <w:tabs>
@@ -3822,6 +7609,126 @@
     <w:abstractNumId w:val="991"/>
   </w:num>
   <w:num w:numId="1026">
+    <w:abstractNumId w:val="991"/>
+  </w:num>
+  <w:num w:numId="1027">
+    <w:abstractNumId w:val="991"/>
+  </w:num>
+  <w:num w:numId="1028">
+    <w:abstractNumId w:val="991"/>
+  </w:num>
+  <w:num w:numId="1029">
+    <w:abstractNumId w:val="991"/>
+  </w:num>
+  <w:num w:numId="1030">
+    <w:abstractNumId w:val="991"/>
+  </w:num>
+  <w:num w:numId="1031">
+    <w:abstractNumId w:val="991"/>
+  </w:num>
+  <w:num w:numId="1032">
+    <w:abstractNumId w:val="99411"/>
+    <w:lvlOverride w:ilvl="0">
+      <w:startOverride w:val="1"/>
+    </w:lvlOverride>
+    <w:lvlOverride w:ilvl="1">
+      <w:startOverride w:val="1"/>
+    </w:lvlOverride>
+    <w:lvlOverride w:ilvl="2">
+      <w:startOverride w:val="1"/>
+    </w:lvlOverride>
+    <w:lvlOverride w:ilvl="3">
+      <w:startOverride w:val="1"/>
+    </w:lvlOverride>
+    <w:lvlOverride w:ilvl="4">
+      <w:startOverride w:val="1"/>
+    </w:lvlOverride>
+    <w:lvlOverride w:ilvl="5">
+      <w:startOverride w:val="1"/>
+    </w:lvlOverride>
+    <w:lvlOverride w:ilvl="6">
+      <w:startOverride w:val="1"/>
+    </w:lvlOverride>
+    <w:lvlOverride w:ilvl="7">
+      <w:startOverride w:val="1"/>
+    </w:lvlOverride>
+    <w:lvlOverride w:ilvl="8">
+      <w:startOverride w:val="1"/>
+    </w:lvlOverride>
+  </w:num>
+  <w:num w:numId="1033">
+    <w:abstractNumId w:val="991"/>
+  </w:num>
+  <w:num w:numId="1034">
+    <w:abstractNumId w:val="991"/>
+  </w:num>
+  <w:num w:numId="1035">
+    <w:abstractNumId w:val="991"/>
+  </w:num>
+  <w:num w:numId="1036">
+    <w:abstractNumId w:val="991"/>
+  </w:num>
+  <w:num w:numId="1037">
+    <w:abstractNumId w:val="991"/>
+  </w:num>
+  <w:num w:numId="1038">
+    <w:abstractNumId w:val="991"/>
+  </w:num>
+  <w:num w:numId="1039">
+    <w:abstractNumId w:val="991"/>
+  </w:num>
+  <w:num w:numId="1040">
+    <w:abstractNumId w:val="991"/>
+  </w:num>
+  <w:num w:numId="1041">
+    <w:abstractNumId w:val="991"/>
+  </w:num>
+  <w:num w:numId="1042">
+    <w:abstractNumId w:val="991"/>
+  </w:num>
+  <w:num w:numId="1043">
+    <w:abstractNumId w:val="991"/>
+  </w:num>
+  <w:num w:numId="1044">
+    <w:abstractNumId w:val="991"/>
+  </w:num>
+  <w:num w:numId="1045">
+    <w:abstractNumId w:val="991"/>
+  </w:num>
+  <w:num w:numId="1046">
+    <w:abstractNumId w:val="991"/>
+  </w:num>
+  <w:num w:numId="1047">
+    <w:abstractNumId w:val="991"/>
+  </w:num>
+  <w:num w:numId="1048">
+    <w:abstractNumId w:val="991"/>
+  </w:num>
+  <w:num w:numId="1049">
+    <w:abstractNumId w:val="991"/>
+  </w:num>
+  <w:num w:numId="1050">
+    <w:abstractNumId w:val="991"/>
+  </w:num>
+  <w:num w:numId="1051">
+    <w:abstractNumId w:val="991"/>
+  </w:num>
+  <w:num w:numId="1052">
+    <w:abstractNumId w:val="991"/>
+  </w:num>
+  <w:num w:numId="1053">
+    <w:abstractNumId w:val="991"/>
+  </w:num>
+  <w:num w:numId="1054">
+    <w:abstractNumId w:val="991"/>
+  </w:num>
+  <w:num w:numId="1055">
+    <w:abstractNumId w:val="991"/>
+  </w:num>
+  <w:num w:numId="1056">
+    <w:abstractNumId w:val="991"/>
+  </w:num>
+  <w:num w:numId="1057">
     <w:abstractNumId w:val="991"/>
   </w:num>
 </w:numbering>

</xml_diff>